<commit_message>
isr rx_done->appli, rtc lock_free
</commit_message>
<xml_diff>
--- a/test_lora.docx
+++ b/test_lora.docx
@@ -43,7 +43,13 @@
           </w:tcPr>
           <w:p>
             <w:r>
-              <w:t>End Node (I)</w:t>
+              <w:t>End Node (</w:t>
+            </w:r>
+            <w:r>
+              <w:t>U</w:t>
+            </w:r>
+            <w:r>
+              <w:t>)</w:t>
             </w:r>
           </w:p>
         </w:tc>
@@ -172,6 +178,453 @@
             </w:r>
             <w:r>
               <w:t>-0</w:t>
+            </w:r>
+          </w:p>
+        </w:tc>
+      </w:tr>
+      <w:tr>
+        <w:tc>
+          <w:tcPr>
+            <w:tcW w:w="2547" w:type="dxa"/>
+          </w:tcPr>
+          <w:p>
+            <w:r>
+              <w:t>En RX</w:t>
+            </w:r>
+          </w:p>
+        </w:tc>
+        <w:tc>
+          <w:tcPr>
+            <w:tcW w:w="4394" w:type="dxa"/>
+          </w:tcPr>
+          <w:p>
+            <w:r>
+              <w:t>ABBB (0x10 : pas d’</w:t>
+            </w:r>
+            <w:proofErr w:type="spellStart"/>
+            <w:r>
+              <w:t>ack</w:t>
+            </w:r>
+            <w:proofErr w:type="spellEnd"/>
+            <w:r>
+              <w:t>, pas de RX)</w:t>
+            </w:r>
+          </w:p>
+        </w:tc>
+        <w:tc>
+          <w:tcPr>
+            <w:tcW w:w="2835" w:type="dxa"/>
+          </w:tcPr>
+          <w:p>
+            <w:r>
+              <w:t>Ok 12-33-40</w:t>
+            </w:r>
+          </w:p>
+        </w:tc>
+      </w:tr>
+      <w:tr>
+        <w:tc>
+          <w:tcPr>
+            <w:tcW w:w="2547" w:type="dxa"/>
+          </w:tcPr>
+          <w:p>
+            <w:r>
+              <w:t>En RX</w:t>
+            </w:r>
+          </w:p>
+        </w:tc>
+        <w:tc>
+          <w:tcPr>
+            <w:tcW w:w="4394" w:type="dxa"/>
+          </w:tcPr>
+          <w:p>
+            <w:r>
+              <w:t>HRLSI (0x10)</w:t>
+            </w:r>
+          </w:p>
+        </w:tc>
+        <w:tc>
+          <w:tcPr>
+            <w:tcW w:w="2835" w:type="dxa"/>
+          </w:tcPr>
+          <w:p>
+            <w:r>
+              <w:t>Ok 12-33-40</w:t>
+            </w:r>
+          </w:p>
+        </w:tc>
+      </w:tr>
+      <w:tr>
+        <w:tc>
+          <w:tcPr>
+            <w:tcW w:w="2547" w:type="dxa"/>
+          </w:tcPr>
+          <w:p>
+            <w:r>
+              <w:t>En RX</w:t>
+            </w:r>
+          </w:p>
+        </w:tc>
+        <w:tc>
+          <w:tcPr>
+            <w:tcW w:w="4394" w:type="dxa"/>
+          </w:tcPr>
+          <w:p>
+            <w:r>
+              <w:t>ABBB (0x30</w:t>
+            </w:r>
+            <w:proofErr w:type="gramStart"/>
+            <w:r>
+              <w:t> :</w:t>
+            </w:r>
+            <w:proofErr w:type="spellStart"/>
+            <w:r>
+              <w:t>Pasd’ack</w:t>
+            </w:r>
+            <w:proofErr w:type="spellEnd"/>
+            <w:proofErr w:type="gramEnd"/>
+            <w:r>
+              <w:t xml:space="preserve">, </w:t>
+            </w:r>
+            <w:proofErr w:type="spellStart"/>
+            <w:r>
+              <w:t>RXapres</w:t>
+            </w:r>
+            <w:proofErr w:type="spellEnd"/>
+            <w:r>
+              <w:t>)</w:t>
+            </w:r>
+          </w:p>
+        </w:tc>
+        <w:tc>
+          <w:tcPr>
+            <w:tcW w:w="2835" w:type="dxa"/>
+          </w:tcPr>
+          <w:p>
+            <w:proofErr w:type="gramStart"/>
+            <w:r>
+              <w:t>ok</w:t>
+            </w:r>
+            <w:proofErr w:type="gramEnd"/>
+            <w:r>
+              <w:t xml:space="preserve"> 12-33-47 </w:t>
+            </w:r>
+          </w:p>
+          <w:p>
+            <w:r>
+              <w:t>Conc</w:t>
+            </w:r>
+            <w:proofErr w:type="gramStart"/>
+            <w:r>
+              <w:t> :corrup</w:t>
+            </w:r>
+            <w:proofErr w:type="gramEnd"/>
+            <w:r>
+              <w:t xml:space="preserve">2 :1 </w:t>
+            </w:r>
+            <w:proofErr w:type="spellStart"/>
+            <w:r>
+              <w:t>dequeue</w:t>
+            </w:r>
+            <w:proofErr w:type="spellEnd"/>
+            <w:r>
+              <w:t xml:space="preserve"> </w:t>
+            </w:r>
+            <w:proofErr w:type="spellStart"/>
+            <w:r>
+              <w:t>ret</w:t>
+            </w:r>
+            <w:proofErr w:type="spellEnd"/>
+            <w:r>
+              <w:t> :1</w:t>
+            </w:r>
+          </w:p>
+          <w:p>
+            <w:proofErr w:type="gramStart"/>
+            <w:r>
+              <w:t>ok</w:t>
+            </w:r>
+            <w:proofErr w:type="gramEnd"/>
+          </w:p>
+        </w:tc>
+      </w:tr>
+      <w:tr>
+        <w:tc>
+          <w:tcPr>
+            <w:tcW w:w="2547" w:type="dxa"/>
+          </w:tcPr>
+          <w:p>
+            <w:r>
+              <w:t>Pas en RX (débranché)</w:t>
+            </w:r>
+          </w:p>
+        </w:tc>
+        <w:tc>
+          <w:tcPr>
+            <w:tcW w:w="4394" w:type="dxa"/>
+          </w:tcPr>
+          <w:p>
+            <w:r>
+              <w:t xml:space="preserve">ABBB (0x00 : </w:t>
+            </w:r>
+            <w:proofErr w:type="spellStart"/>
+            <w:r>
+              <w:t>Ack</w:t>
+            </w:r>
+            <w:proofErr w:type="spellEnd"/>
+            <w:r>
+              <w:t>, pas de ren</w:t>
+            </w:r>
+            <w:r>
+              <w:t xml:space="preserve">voi, pas de RX </w:t>
+            </w:r>
+            <w:proofErr w:type="spellStart"/>
+            <w:r>
+              <w:t>apres</w:t>
+            </w:r>
+            <w:proofErr w:type="spellEnd"/>
+            <w:r>
+              <w:t xml:space="preserve">) </w:t>
+            </w:r>
+            <w:proofErr w:type="spellStart"/>
+            <w:r>
+              <w:t>Cla</w:t>
+            </w:r>
+            <w:proofErr w:type="spellEnd"/>
+            <w:proofErr w:type="gramStart"/>
+            <w:r>
+              <w:t> :A</w:t>
+            </w:r>
+            <w:proofErr w:type="gramEnd"/>
+            <w:r>
+              <w:t xml:space="preserve">     </w:t>
+            </w:r>
+          </w:p>
+        </w:tc>
+        <w:tc>
+          <w:tcPr>
+            <w:tcW w:w="2835" w:type="dxa"/>
+          </w:tcPr>
+          <w:p>
+            <w:r>
+              <w:t>Ok 12-33-46 –T0</w:t>
+            </w:r>
+          </w:p>
+        </w:tc>
+      </w:tr>
+      <w:tr>
+        <w:tc>
+          <w:tcPr>
+            <w:tcW w:w="2547" w:type="dxa"/>
+          </w:tcPr>
+          <w:p>
+            <w:r>
+              <w:t>En RX</w:t>
+            </w:r>
+          </w:p>
+        </w:tc>
+        <w:tc>
+          <w:tcPr>
+            <w:tcW w:w="4394" w:type="dxa"/>
+          </w:tcPr>
+          <w:p>
+            <w:r>
+              <w:t xml:space="preserve">ABBB (0x00 : </w:t>
+            </w:r>
+            <w:proofErr w:type="spellStart"/>
+            <w:r>
+              <w:t>Ack</w:t>
+            </w:r>
+            <w:proofErr w:type="spellEnd"/>
+            <w:r>
+              <w:t>, pas de ren</w:t>
+            </w:r>
+            <w:r>
+              <w:t xml:space="preserve">voi, pas de RX </w:t>
+            </w:r>
+            <w:proofErr w:type="spellStart"/>
+            <w:r>
+              <w:t>apres</w:t>
+            </w:r>
+            <w:proofErr w:type="spellEnd"/>
+            <w:r>
+              <w:t xml:space="preserve">) </w:t>
+            </w:r>
+            <w:proofErr w:type="spellStart"/>
+            <w:r>
+              <w:t>Cla</w:t>
+            </w:r>
+            <w:proofErr w:type="spellEnd"/>
+            <w:proofErr w:type="gramStart"/>
+            <w:r>
+              <w:t> :A</w:t>
+            </w:r>
+            <w:proofErr w:type="gramEnd"/>
+            <w:r>
+              <w:t xml:space="preserve">     </w:t>
+            </w:r>
+          </w:p>
+        </w:tc>
+        <w:tc>
+          <w:tcPr>
+            <w:tcW w:w="2835" w:type="dxa"/>
+          </w:tcPr>
+          <w:p>
+            <w:r>
+              <w:t>Pb 12-33-46</w:t>
+            </w:r>
+            <w:r>
+              <w:t xml:space="preserve"> plante</w:t>
+            </w:r>
+            <w:r>
+              <w:t xml:space="preserve"> </w:t>
+            </w:r>
+            <w:proofErr w:type="spellStart"/>
+            <w:r>
+              <w:t>recep</w:t>
+            </w:r>
+            <w:proofErr w:type="spellEnd"/>
+            <w:r>
+              <w:t xml:space="preserve"> </w:t>
+            </w:r>
+            <w:proofErr w:type="spellStart"/>
+            <w:r>
+              <w:t>ack</w:t>
+            </w:r>
+            <w:proofErr w:type="spellEnd"/>
+          </w:p>
+        </w:tc>
+      </w:tr>
+      <w:tr>
+        <w:tc>
+          <w:tcPr>
+            <w:tcW w:w="2547" w:type="dxa"/>
+          </w:tcPr>
+          <w:p>
+            <w:r>
+              <w:t>En RX</w:t>
+            </w:r>
+          </w:p>
+        </w:tc>
+        <w:tc>
+          <w:tcPr>
+            <w:tcW w:w="4394" w:type="dxa"/>
+          </w:tcPr>
+          <w:p>
+            <w:r>
+              <w:t>ABBB (0x</w:t>
+            </w:r>
+            <w:r>
+              <w:t>20</w:t>
+            </w:r>
+            <w:r>
+              <w:t xml:space="preserve"> : </w:t>
+            </w:r>
+            <w:proofErr w:type="spellStart"/>
+            <w:r>
+              <w:t>Ack</w:t>
+            </w:r>
+            <w:proofErr w:type="spellEnd"/>
+            <w:r>
+              <w:t xml:space="preserve">, </w:t>
+            </w:r>
+            <w:r>
+              <w:t>pas de</w:t>
+            </w:r>
+            <w:r>
+              <w:t xml:space="preserve"> ren</w:t>
+            </w:r>
+            <w:r>
+              <w:t xml:space="preserve">voi, RX </w:t>
+            </w:r>
+            <w:proofErr w:type="spellStart"/>
+            <w:r>
+              <w:t>apres</w:t>
+            </w:r>
+            <w:proofErr w:type="spellEnd"/>
+            <w:r>
+              <w:t xml:space="preserve">) </w:t>
+            </w:r>
+            <w:proofErr w:type="spellStart"/>
+            <w:r>
+              <w:t>Cla</w:t>
+            </w:r>
+            <w:proofErr w:type="spellEnd"/>
+            <w:proofErr w:type="gramStart"/>
+            <w:r>
+              <w:t> :A</w:t>
+            </w:r>
+            <w:proofErr w:type="gramEnd"/>
+            <w:r>
+              <w:t xml:space="preserve">     </w:t>
+            </w:r>
+          </w:p>
+        </w:tc>
+        <w:tc>
+          <w:tcPr>
+            <w:tcW w:w="2835" w:type="dxa"/>
+          </w:tcPr>
+          <w:p>
+            <w:proofErr w:type="gramStart"/>
+            <w:r>
+              <w:t>pb</w:t>
+            </w:r>
+            <w:proofErr w:type="gramEnd"/>
+            <w:r>
+              <w:t xml:space="preserve"> 12-33-46-plante 57</w:t>
+            </w:r>
+          </w:p>
+        </w:tc>
+      </w:tr>
+      <w:tr>
+        <w:tc>
+          <w:tcPr>
+            <w:tcW w:w="2547" w:type="dxa"/>
+          </w:tcPr>
+          <w:p>
+            <w:r>
+              <w:t>1) USLO (0x10)</w:t>
+            </w:r>
+          </w:p>
+        </w:tc>
+        <w:tc>
+          <w:tcPr>
+            <w:tcW w:w="4394" w:type="dxa"/>
+          </w:tcPr>
+          <w:p>
+            <w:r>
+              <w:t>2)ABBB (0x30)</w:t>
+            </w:r>
+          </w:p>
+        </w:tc>
+        <w:tc>
+          <w:tcPr>
+            <w:tcW w:w="2835" w:type="dxa"/>
+          </w:tcPr>
+          <w:p>
+            <w:r>
+              <w:t>End : 12-33-47</w:t>
+            </w:r>
+          </w:p>
+          <w:p>
+            <w:r>
+              <w:t>Conc : 02-33-40</w:t>
+            </w:r>
+          </w:p>
+          <w:p>
+            <w:r>
+              <w:t>End :plante</w:t>
+            </w:r>
+            <w:r>
+              <w:t xml:space="preserve"> </w:t>
+            </w:r>
+            <w:proofErr w:type="spellStart"/>
+            <w:r>
+              <w:t>recep</w:t>
+            </w:r>
+            <w:proofErr w:type="spellEnd"/>
+            <w:r>
+              <w:t xml:space="preserve"> mess</w:t>
             </w:r>
             <w:bookmarkStart w:id="0" w:name="_GoBack"/>
             <w:bookmarkEnd w:id="0"/>
@@ -195,7 +648,65 @@
           </w:tcPr>
           <w:p>
             <w:r>
-              <w:t xml:space="preserve">ABBB (0x00 : </w:t>
+              <w:t>HSLO (0x30</w:t>
+            </w:r>
+            <w:proofErr w:type="gramStart"/>
+            <w:r>
+              <w:t> :Pas</w:t>
+            </w:r>
+            <w:proofErr w:type="gramEnd"/>
+            <w:r>
+              <w:t xml:space="preserve"> d’</w:t>
+            </w:r>
+            <w:proofErr w:type="spellStart"/>
+            <w:r>
+              <w:t>ack</w:t>
+            </w:r>
+            <w:proofErr w:type="spellEnd"/>
+            <w:r>
+              <w:t xml:space="preserve">, RX </w:t>
+            </w:r>
+            <w:proofErr w:type="spellStart"/>
+            <w:r>
+              <w:t>apres</w:t>
+            </w:r>
+            <w:proofErr w:type="spellEnd"/>
+            <w:r>
+              <w:t>)</w:t>
+            </w:r>
+          </w:p>
+        </w:tc>
+        <w:tc>
+          <w:tcPr>
+            <w:tcW w:w="2835" w:type="dxa"/>
+          </w:tcPr>
+          <w:p/>
+        </w:tc>
+      </w:tr>
+      <w:tr>
+        <w:tc>
+          <w:tcPr>
+            <w:tcW w:w="2547" w:type="dxa"/>
+          </w:tcPr>
+          <w:p>
+            <w:r>
+              <w:t>En RX</w:t>
+            </w:r>
+          </w:p>
+        </w:tc>
+        <w:tc>
+          <w:tcPr>
+            <w:tcW w:w="4394" w:type="dxa"/>
+          </w:tcPr>
+          <w:p>
+            <w:r>
+              <w:t>ABBB (0x0</w:t>
+            </w:r>
+            <w:r>
+              <w:t>2</w:t>
+            </w:r>
+            <w:r>
+              <w:t xml:space="preserve"> : </w:t>
             </w:r>
             <w:proofErr w:type="spellStart"/>
             <w:r>
@@ -203,7 +714,13 @@
             </w:r>
             <w:proofErr w:type="spellEnd"/>
             <w:r>
-              <w:t>, pas de ren</w:t>
+              <w:t xml:space="preserve">, </w:t>
+            </w:r>
+            <w:r>
+              <w:t>1</w:t>
+            </w:r>
+            <w:r>
+              <w:t xml:space="preserve"> ren</w:t>
             </w:r>
             <w:r>
               <w:t xml:space="preserve">voi, pas de RX </w:t>
@@ -255,7 +772,13 @@
           </w:tcPr>
           <w:p>
             <w:r>
-              <w:t xml:space="preserve">ABBB (0x00 : </w:t>
+              <w:t>ABBB (0x0</w:t>
+            </w:r>
+            <w:r>
+              <w:t>2</w:t>
+            </w:r>
+            <w:r>
+              <w:t xml:space="preserve"> : </w:t>
             </w:r>
             <w:proofErr w:type="spellStart"/>
             <w:r>
@@ -263,7 +786,13 @@
             </w:r>
             <w:proofErr w:type="spellEnd"/>
             <w:r>
-              <w:t>, pas de ren</w:t>
+              <w:t xml:space="preserve">, </w:t>
+            </w:r>
+            <w:r>
+              <w:t>1</w:t>
+            </w:r>
+            <w:r>
+              <w:t xml:space="preserve"> ren</w:t>
             </w:r>
             <w:r>
               <w:t xml:space="preserve">voi, pas de RX </w:t>
@@ -318,7 +847,7 @@
               <w:t>ABBB (0x0</w:t>
             </w:r>
             <w:r>
-              <w:t>2</w:t>
+              <w:t>4</w:t>
             </w:r>
             <w:r>
               <w:t xml:space="preserve"> : </w:t>
@@ -332,7 +861,7 @@
               <w:t xml:space="preserve">, </w:t>
             </w:r>
             <w:r>
-              <w:t>1</w:t>
+              <w:t>3</w:t>
             </w:r>
             <w:r>
               <w:t xml:space="preserve"> ren</w:t>
@@ -390,7 +919,7 @@
               <w:t>ABBB (0x0</w:t>
             </w:r>
             <w:r>
-              <w:t>2</w:t>
+              <w:t>4</w:t>
             </w:r>
             <w:r>
               <w:t xml:space="preserve"> : </w:t>
@@ -404,7 +933,7 @@
               <w:t xml:space="preserve">, </w:t>
             </w:r>
             <w:r>
-              <w:t>1</w:t>
+              <w:t>3</w:t>
             </w:r>
             <w:r>
               <w:t xml:space="preserve"> ren</w:t>
@@ -440,226 +969,6 @@
             <w:tcW w:w="2835" w:type="dxa"/>
           </w:tcPr>
           <w:p/>
-        </w:tc>
-      </w:tr>
-      <w:tr>
-        <w:tc>
-          <w:tcPr>
-            <w:tcW w:w="2547" w:type="dxa"/>
-          </w:tcPr>
-          <w:p>
-            <w:r>
-              <w:t>En RX</w:t>
-            </w:r>
-          </w:p>
-        </w:tc>
-        <w:tc>
-          <w:tcPr>
-            <w:tcW w:w="4394" w:type="dxa"/>
-          </w:tcPr>
-          <w:p>
-            <w:r>
-              <w:t>ABBB (0x0</w:t>
-            </w:r>
-            <w:r>
-              <w:t>4</w:t>
-            </w:r>
-            <w:r>
-              <w:t xml:space="preserve"> : </w:t>
-            </w:r>
-            <w:proofErr w:type="spellStart"/>
-            <w:r>
-              <w:t>Ack</w:t>
-            </w:r>
-            <w:proofErr w:type="spellEnd"/>
-            <w:r>
-              <w:t xml:space="preserve">, </w:t>
-            </w:r>
-            <w:r>
-              <w:t>3</w:t>
-            </w:r>
-            <w:r>
-              <w:t xml:space="preserve"> ren</w:t>
-            </w:r>
-            <w:r>
-              <w:t xml:space="preserve">voi, pas de RX </w:t>
-            </w:r>
-            <w:proofErr w:type="spellStart"/>
-            <w:r>
-              <w:t>apres</w:t>
-            </w:r>
-            <w:proofErr w:type="spellEnd"/>
-            <w:r>
-              <w:t xml:space="preserve">) </w:t>
-            </w:r>
-            <w:proofErr w:type="spellStart"/>
-            <w:r>
-              <w:t>Cla</w:t>
-            </w:r>
-            <w:proofErr w:type="spellEnd"/>
-            <w:proofErr w:type="gramStart"/>
-            <w:r>
-              <w:t> :A</w:t>
-            </w:r>
-            <w:proofErr w:type="gramEnd"/>
-            <w:r>
-              <w:t xml:space="preserve">     </w:t>
-            </w:r>
-          </w:p>
-        </w:tc>
-        <w:tc>
-          <w:tcPr>
-            <w:tcW w:w="2835" w:type="dxa"/>
-          </w:tcPr>
-          <w:p/>
-        </w:tc>
-      </w:tr>
-      <w:tr>
-        <w:tc>
-          <w:tcPr>
-            <w:tcW w:w="2547" w:type="dxa"/>
-          </w:tcPr>
-          <w:p>
-            <w:r>
-              <w:t>Pas en RX (débranché)</w:t>
-            </w:r>
-          </w:p>
-        </w:tc>
-        <w:tc>
-          <w:tcPr>
-            <w:tcW w:w="4394" w:type="dxa"/>
-          </w:tcPr>
-          <w:p>
-            <w:r>
-              <w:t>ABBB (0x0</w:t>
-            </w:r>
-            <w:r>
-              <w:t>4</w:t>
-            </w:r>
-            <w:r>
-              <w:t xml:space="preserve"> : </w:t>
-            </w:r>
-            <w:proofErr w:type="spellStart"/>
-            <w:r>
-              <w:t>Ack</w:t>
-            </w:r>
-            <w:proofErr w:type="spellEnd"/>
-            <w:r>
-              <w:t xml:space="preserve">, </w:t>
-            </w:r>
-            <w:r>
-              <w:t>3</w:t>
-            </w:r>
-            <w:r>
-              <w:t xml:space="preserve"> ren</w:t>
-            </w:r>
-            <w:r>
-              <w:t xml:space="preserve">voi, pas de RX </w:t>
-            </w:r>
-            <w:proofErr w:type="spellStart"/>
-            <w:r>
-              <w:t>apres</w:t>
-            </w:r>
-            <w:proofErr w:type="spellEnd"/>
-            <w:r>
-              <w:t xml:space="preserve">) </w:t>
-            </w:r>
-            <w:proofErr w:type="spellStart"/>
-            <w:r>
-              <w:t>Cla</w:t>
-            </w:r>
-            <w:proofErr w:type="spellEnd"/>
-            <w:proofErr w:type="gramStart"/>
-            <w:r>
-              <w:t> :A</w:t>
-            </w:r>
-            <w:proofErr w:type="gramEnd"/>
-            <w:r>
-              <w:t xml:space="preserve">     </w:t>
-            </w:r>
-          </w:p>
-        </w:tc>
-        <w:tc>
-          <w:tcPr>
-            <w:tcW w:w="2835" w:type="dxa"/>
-          </w:tcPr>
-          <w:p/>
-        </w:tc>
-      </w:tr>
-      <w:tr>
-        <w:tc>
-          <w:tcPr>
-            <w:tcW w:w="2547" w:type="dxa"/>
-          </w:tcPr>
-          <w:p>
-            <w:r>
-              <w:t>En RX</w:t>
-            </w:r>
-          </w:p>
-        </w:tc>
-        <w:tc>
-          <w:tcPr>
-            <w:tcW w:w="4394" w:type="dxa"/>
-          </w:tcPr>
-          <w:p>
-            <w:r>
-              <w:t>ABBB (0x</w:t>
-            </w:r>
-            <w:r>
-              <w:t>20</w:t>
-            </w:r>
-            <w:r>
-              <w:t xml:space="preserve"> : </w:t>
-            </w:r>
-            <w:proofErr w:type="spellStart"/>
-            <w:r>
-              <w:t>Ack</w:t>
-            </w:r>
-            <w:proofErr w:type="spellEnd"/>
-            <w:r>
-              <w:t xml:space="preserve">, </w:t>
-            </w:r>
-            <w:r>
-              <w:t>pas de</w:t>
-            </w:r>
-            <w:r>
-              <w:t xml:space="preserve"> ren</w:t>
-            </w:r>
-            <w:r>
-              <w:t xml:space="preserve">voi, RX </w:t>
-            </w:r>
-            <w:proofErr w:type="spellStart"/>
-            <w:r>
-              <w:t>apres</w:t>
-            </w:r>
-            <w:proofErr w:type="spellEnd"/>
-            <w:r>
-              <w:t xml:space="preserve">) </w:t>
-            </w:r>
-            <w:proofErr w:type="spellStart"/>
-            <w:r>
-              <w:t>Cla</w:t>
-            </w:r>
-            <w:proofErr w:type="spellEnd"/>
-            <w:proofErr w:type="gramStart"/>
-            <w:r>
-              <w:t> :A</w:t>
-            </w:r>
-            <w:proofErr w:type="gramEnd"/>
-            <w:r>
-              <w:t xml:space="preserve">     </w:t>
-            </w:r>
-          </w:p>
-        </w:tc>
-        <w:tc>
-          <w:tcPr>
-            <w:tcW w:w="2835" w:type="dxa"/>
-          </w:tcPr>
-          <w:p>
-            <w:r>
-              <w:t>Ok 12-33-46-57</w:t>
-            </w:r>
-          </w:p>
         </w:tc>
       </w:tr>
       <w:tr>
@@ -1458,6 +1767,7 @@
         <w:spacing w:after="0" w:line="240" w:lineRule="auto"/>
       </w:pPr>
       <w:r>
+        <w:lastRenderedPageBreak/>
         <w:t xml:space="preserve">0x22 : </w:t>
       </w:r>
       <w:proofErr w:type="spellStart"/>
@@ -1494,6 +1804,27 @@
         <w:t>apres</w:t>
       </w:r>
       <w:proofErr w:type="spellEnd"/>
+    </w:p>
+    <w:p>
+      <w:pPr>
+        <w:spacing w:after="0" w:line="240" w:lineRule="auto"/>
+      </w:pPr>
+    </w:p>
+    <w:p>
+      <w:pPr>
+        <w:spacing w:after="0" w:line="240" w:lineRule="auto"/>
+      </w:pPr>
+      <w:r>
+        <w:t xml:space="preserve">Message </w:t>
+      </w:r>
+      <w:proofErr w:type="spellStart"/>
+      <w:r>
+        <w:t>recu</w:t>
+      </w:r>
+      <w:proofErr w:type="spellEnd"/>
+      <w:r>
+        <w:t xml:space="preserve"> par concentrateur : </w:t>
+      </w:r>
     </w:p>
     <w:p>
       <w:pPr>
@@ -1954,6 +2285,17 @@
       </w:tblBorders>
     </w:tblPr>
   </w:style>
+  <w:style w:type="paragraph" w:styleId="Paragraphedeliste">
+    <w:name w:val="List Paragraph"/>
+    <w:basedOn w:val="Normal"/>
+    <w:uiPriority w:val="34"/>
+    <w:qFormat/>
+    <w:rsid w:val="00B33917"/>
+    <w:pPr>
+      <w:ind w:left="720"/>
+      <w:contextualSpacing/>
+    </w:pPr>
+  </w:style>
 </w:styles>
 </file>
 

</xml_diff>

<commit_message>
valid premiers tests lora
</commit_message>
<xml_diff>
--- a/test_lora.docx
+++ b/test_lora.docx
@@ -173,11 +173,22 @@
             <w:tcW w:w="2835" w:type="dxa"/>
           </w:tcPr>
           <w:p>
-            <w:r>
-              <w:t>ok 12-33-47</w:t>
-            </w:r>
-            <w:r>
-              <w:t>-0</w:t>
+            <w:proofErr w:type="gramStart"/>
+            <w:r>
+              <w:t>ok</w:t>
+            </w:r>
+            <w:proofErr w:type="gramEnd"/>
+            <w:r>
+              <w:t xml:space="preserve"> 12-33-47</w:t>
+            </w:r>
+            <w:r>
+              <w:t>-</w:t>
+            </w:r>
+            <w:r>
+              <w:t>T</w:t>
+            </w:r>
+            <w:r>
+              <w:t>0</w:t>
             </w:r>
           </w:p>
         </w:tc>
@@ -263,371 +274,458 @@
             <w:r>
               <w:t>En RX</w:t>
             </w:r>
-          </w:p>
-        </w:tc>
-        <w:tc>
-          <w:tcPr>
-            <w:tcW w:w="4394" w:type="dxa"/>
-          </w:tcPr>
-          <w:p>
-            <w:r>
-              <w:t>ABBB (0x30</w:t>
-            </w:r>
-            <w:proofErr w:type="gramStart"/>
-            <w:r>
-              <w:t> :</w:t>
-            </w:r>
-            <w:proofErr w:type="spellStart"/>
-            <w:r>
-              <w:t>Pasd’ack</w:t>
-            </w:r>
-            <w:proofErr w:type="spellEnd"/>
-            <w:proofErr w:type="gramEnd"/>
-            <w:r>
-              <w:t xml:space="preserve">, </w:t>
-            </w:r>
-            <w:proofErr w:type="spellStart"/>
-            <w:r>
-              <w:t>RXapres</w:t>
-            </w:r>
-            <w:proofErr w:type="spellEnd"/>
-            <w:r>
-              <w:t>)</w:t>
-            </w:r>
-          </w:p>
-        </w:tc>
-        <w:tc>
-          <w:tcPr>
-            <w:tcW w:w="2835" w:type="dxa"/>
-          </w:tcPr>
-          <w:p>
-            <w:proofErr w:type="gramStart"/>
-            <w:r>
-              <w:t>ok</w:t>
-            </w:r>
-            <w:proofErr w:type="gramEnd"/>
-            <w:r>
-              <w:t xml:space="preserve"> 12-33-47 </w:t>
-            </w:r>
-          </w:p>
-          <w:p>
-            <w:r>
-              <w:t>Conc</w:t>
-            </w:r>
-            <w:proofErr w:type="gramStart"/>
-            <w:r>
-              <w:t> :corrup</w:t>
-            </w:r>
-            <w:proofErr w:type="gramEnd"/>
-            <w:r>
-              <w:t xml:space="preserve">2 :1 </w:t>
-            </w:r>
-            <w:proofErr w:type="spellStart"/>
-            <w:r>
-              <w:t>dequeue</w:t>
-            </w:r>
-            <w:proofErr w:type="spellEnd"/>
-            <w:r>
-              <w:t xml:space="preserve"> </w:t>
-            </w:r>
-            <w:proofErr w:type="spellStart"/>
-            <w:r>
-              <w:t>ret</w:t>
-            </w:r>
-            <w:proofErr w:type="spellEnd"/>
-            <w:r>
-              <w:t> :1</w:t>
-            </w:r>
-          </w:p>
-          <w:p>
-            <w:proofErr w:type="gramStart"/>
-            <w:r>
-              <w:t>ok</w:t>
-            </w:r>
-            <w:proofErr w:type="gramEnd"/>
-          </w:p>
-        </w:tc>
-      </w:tr>
-      <w:tr>
-        <w:tc>
-          <w:tcPr>
-            <w:tcW w:w="2547" w:type="dxa"/>
-          </w:tcPr>
-          <w:p>
-            <w:r>
-              <w:t>Pas en RX (débranché)</w:t>
-            </w:r>
-          </w:p>
-        </w:tc>
-        <w:tc>
-          <w:tcPr>
-            <w:tcW w:w="4394" w:type="dxa"/>
-          </w:tcPr>
-          <w:p>
-            <w:r>
-              <w:t xml:space="preserve">ABBB (0x00 : </w:t>
-            </w:r>
-            <w:proofErr w:type="spellStart"/>
-            <w:r>
-              <w:t>Ack</w:t>
-            </w:r>
-            <w:proofErr w:type="spellEnd"/>
-            <w:r>
-              <w:t>, pas de ren</w:t>
-            </w:r>
-            <w:r>
-              <w:t xml:space="preserve">voi, pas de RX </w:t>
-            </w:r>
-            <w:proofErr w:type="spellStart"/>
-            <w:r>
-              <w:t>apres</w:t>
-            </w:r>
-            <w:proofErr w:type="spellEnd"/>
-            <w:r>
-              <w:t xml:space="preserve">) </w:t>
-            </w:r>
-            <w:proofErr w:type="spellStart"/>
-            <w:r>
-              <w:t>Cla</w:t>
-            </w:r>
-            <w:proofErr w:type="spellEnd"/>
-            <w:proofErr w:type="gramStart"/>
-            <w:r>
-              <w:t> :A</w:t>
-            </w:r>
-            <w:proofErr w:type="gramEnd"/>
-            <w:r>
-              <w:t xml:space="preserve">     </w:t>
-            </w:r>
-          </w:p>
-        </w:tc>
-        <w:tc>
-          <w:tcPr>
-            <w:tcW w:w="2835" w:type="dxa"/>
-          </w:tcPr>
-          <w:p>
-            <w:r>
-              <w:t>Ok 12-33-46 –T0</w:t>
-            </w:r>
-          </w:p>
-        </w:tc>
-      </w:tr>
-      <w:tr>
-        <w:tc>
-          <w:tcPr>
-            <w:tcW w:w="2547" w:type="dxa"/>
-          </w:tcPr>
-          <w:p>
-            <w:r>
-              <w:t>En RX</w:t>
-            </w:r>
-          </w:p>
-        </w:tc>
-        <w:tc>
-          <w:tcPr>
-            <w:tcW w:w="4394" w:type="dxa"/>
-          </w:tcPr>
-          <w:p>
-            <w:r>
-              <w:t xml:space="preserve">ABBB (0x00 : </w:t>
-            </w:r>
-            <w:proofErr w:type="spellStart"/>
-            <w:r>
-              <w:t>Ack</w:t>
-            </w:r>
-            <w:proofErr w:type="spellEnd"/>
-            <w:r>
-              <w:t>, pas de ren</w:t>
-            </w:r>
-            <w:r>
-              <w:t xml:space="preserve">voi, pas de RX </w:t>
-            </w:r>
-            <w:proofErr w:type="spellStart"/>
-            <w:r>
-              <w:t>apres</w:t>
-            </w:r>
-            <w:proofErr w:type="spellEnd"/>
-            <w:r>
-              <w:t xml:space="preserve">) </w:t>
-            </w:r>
-            <w:proofErr w:type="spellStart"/>
-            <w:r>
-              <w:t>Cla</w:t>
-            </w:r>
-            <w:proofErr w:type="spellEnd"/>
-            <w:proofErr w:type="gramStart"/>
-            <w:r>
-              <w:t> :A</w:t>
-            </w:r>
-            <w:proofErr w:type="gramEnd"/>
-            <w:r>
-              <w:t xml:space="preserve">     </w:t>
-            </w:r>
-          </w:p>
-        </w:tc>
-        <w:tc>
-          <w:tcPr>
-            <w:tcW w:w="2835" w:type="dxa"/>
-          </w:tcPr>
-          <w:p>
-            <w:r>
-              <w:t>Pb 12-33-46</w:t>
-            </w:r>
-            <w:r>
-              <w:t xml:space="preserve"> plante</w:t>
-            </w:r>
-            <w:r>
-              <w:t xml:space="preserve"> </w:t>
-            </w:r>
-            <w:proofErr w:type="spellStart"/>
-            <w:r>
-              <w:t>recep</w:t>
-            </w:r>
-            <w:proofErr w:type="spellEnd"/>
-            <w:r>
-              <w:t xml:space="preserve"> </w:t>
-            </w:r>
-            <w:proofErr w:type="spellStart"/>
-            <w:r>
-              <w:t>ack</w:t>
-            </w:r>
-            <w:proofErr w:type="spellEnd"/>
-          </w:p>
-        </w:tc>
-      </w:tr>
-      <w:tr>
-        <w:tc>
-          <w:tcPr>
-            <w:tcW w:w="2547" w:type="dxa"/>
-          </w:tcPr>
-          <w:p>
-            <w:r>
-              <w:t>En RX</w:t>
-            </w:r>
-          </w:p>
-        </w:tc>
-        <w:tc>
-          <w:tcPr>
-            <w:tcW w:w="4394" w:type="dxa"/>
-          </w:tcPr>
-          <w:p>
-            <w:r>
-              <w:t>ABBB (0x</w:t>
-            </w:r>
-            <w:r>
-              <w:t>20</w:t>
-            </w:r>
-            <w:r>
-              <w:t xml:space="preserve"> : </w:t>
-            </w:r>
-            <w:proofErr w:type="spellStart"/>
-            <w:r>
-              <w:t>Ack</w:t>
-            </w:r>
-            <w:proofErr w:type="spellEnd"/>
-            <w:r>
-              <w:t xml:space="preserve">, </w:t>
-            </w:r>
-            <w:r>
-              <w:t>pas de</w:t>
-            </w:r>
-            <w:r>
-              <w:t xml:space="preserve"> ren</w:t>
-            </w:r>
-            <w:r>
-              <w:t xml:space="preserve">voi, RX </w:t>
-            </w:r>
-            <w:proofErr w:type="spellStart"/>
-            <w:r>
-              <w:t>apres</w:t>
-            </w:r>
-            <w:proofErr w:type="spellEnd"/>
-            <w:r>
-              <w:t xml:space="preserve">) </w:t>
-            </w:r>
-            <w:proofErr w:type="spellStart"/>
-            <w:r>
-              <w:t>Cla</w:t>
-            </w:r>
-            <w:proofErr w:type="spellEnd"/>
-            <w:proofErr w:type="gramStart"/>
-            <w:r>
-              <w:t> :A</w:t>
-            </w:r>
-            <w:proofErr w:type="gramEnd"/>
-            <w:r>
-              <w:t xml:space="preserve">     </w:t>
-            </w:r>
-          </w:p>
-        </w:tc>
-        <w:tc>
-          <w:tcPr>
-            <w:tcW w:w="2835" w:type="dxa"/>
-          </w:tcPr>
-          <w:p>
-            <w:proofErr w:type="gramStart"/>
-            <w:r>
-              <w:t>pb</w:t>
-            </w:r>
-            <w:proofErr w:type="gramEnd"/>
-            <w:r>
-              <w:t xml:space="preserve"> 12-33-46-plante 57</w:t>
-            </w:r>
-          </w:p>
-        </w:tc>
-      </w:tr>
-      <w:tr>
-        <w:tc>
-          <w:tcPr>
-            <w:tcW w:w="2547" w:type="dxa"/>
-          </w:tcPr>
-          <w:p>
-            <w:r>
-              <w:t>1) USLO (0x10)</w:t>
-            </w:r>
-          </w:p>
-        </w:tc>
-        <w:tc>
-          <w:tcPr>
-            <w:tcW w:w="4394" w:type="dxa"/>
-          </w:tcPr>
-          <w:p>
-            <w:r>
-              <w:t>2)ABBB (0x30)</w:t>
-            </w:r>
-          </w:p>
-        </w:tc>
-        <w:tc>
-          <w:tcPr>
-            <w:tcW w:w="2835" w:type="dxa"/>
-          </w:tcPr>
-          <w:p>
-            <w:r>
-              <w:t>End : 12-33-47</w:t>
-            </w:r>
-          </w:p>
-          <w:p>
-            <w:r>
-              <w:t>Conc : 02-33-40</w:t>
-            </w:r>
-          </w:p>
-          <w:p>
-            <w:r>
-              <w:t>End :plante</w:t>
-            </w:r>
-            <w:r>
-              <w:t xml:space="preserve"> </w:t>
-            </w:r>
-            <w:proofErr w:type="spellStart"/>
-            <w:r>
-              <w:t>recep</w:t>
-            </w:r>
-            <w:proofErr w:type="spellEnd"/>
-            <w:r>
-              <w:t xml:space="preserve"> mess</w:t>
+            <w:r>
+              <w:t xml:space="preserve"> ou</w:t>
             </w:r>
             <w:bookmarkStart w:id="0" w:name="_GoBack"/>
             <w:bookmarkEnd w:id="0"/>
+            <w:r>
+              <w:t xml:space="preserve"> 1 :UABC</w:t>
+            </w:r>
+          </w:p>
+        </w:tc>
+        <w:tc>
+          <w:tcPr>
+            <w:tcW w:w="4394" w:type="dxa"/>
+          </w:tcPr>
+          <w:p>
+            <w:r>
+              <w:t>ABBB (0x30</w:t>
+            </w:r>
+            <w:proofErr w:type="gramStart"/>
+            <w:r>
+              <w:t> :</w:t>
+            </w:r>
+            <w:proofErr w:type="spellStart"/>
+            <w:r>
+              <w:t>Pasd’ack</w:t>
+            </w:r>
+            <w:proofErr w:type="spellEnd"/>
+            <w:proofErr w:type="gramEnd"/>
+            <w:r>
+              <w:t xml:space="preserve">, </w:t>
+            </w:r>
+            <w:proofErr w:type="spellStart"/>
+            <w:r>
+              <w:t>RXapres</w:t>
+            </w:r>
+            <w:proofErr w:type="spellEnd"/>
+            <w:r>
+              <w:t>)</w:t>
+            </w:r>
+          </w:p>
+        </w:tc>
+        <w:tc>
+          <w:tcPr>
+            <w:tcW w:w="2835" w:type="dxa"/>
+          </w:tcPr>
+          <w:p>
+            <w:proofErr w:type="gramStart"/>
+            <w:r>
+              <w:t>ok</w:t>
+            </w:r>
+            <w:proofErr w:type="gramEnd"/>
+            <w:r>
+              <w:t xml:space="preserve"> 12-33-47 </w:t>
+            </w:r>
+            <w:r>
+              <w:t>puis RX reçu</w:t>
+            </w:r>
+          </w:p>
+          <w:p>
+            <w:proofErr w:type="spellStart"/>
+            <w:r>
+              <w:t>Timer</w:t>
+            </w:r>
+            <w:proofErr w:type="spellEnd"/>
+            <w:r>
+              <w:t xml:space="preserve"> </w:t>
+            </w:r>
+            <w:proofErr w:type="spellStart"/>
+            <w:r>
+              <w:t>lora</w:t>
+            </w:r>
+            <w:proofErr w:type="spellEnd"/>
+            <w:r>
+              <w:t xml:space="preserve"> </w:t>
+            </w:r>
+            <w:proofErr w:type="spellStart"/>
+            <w:r>
+              <w:t>tx</w:t>
+            </w:r>
+            <w:proofErr w:type="spellEnd"/>
+          </w:p>
+        </w:tc>
+      </w:tr>
+      <w:tr>
+        <w:tc>
+          <w:tcPr>
+            <w:tcW w:w="2547" w:type="dxa"/>
+          </w:tcPr>
+          <w:p>
+            <w:r>
+              <w:t>Pas en RX (débranché)</w:t>
+            </w:r>
+          </w:p>
+        </w:tc>
+        <w:tc>
+          <w:tcPr>
+            <w:tcW w:w="4394" w:type="dxa"/>
+          </w:tcPr>
+          <w:p>
+            <w:r>
+              <w:t xml:space="preserve">ABBB (0x00 : </w:t>
+            </w:r>
+            <w:proofErr w:type="spellStart"/>
+            <w:r>
+              <w:t>Ack</w:t>
+            </w:r>
+            <w:proofErr w:type="spellEnd"/>
+            <w:r>
+              <w:t>, pas de ren</w:t>
+            </w:r>
+            <w:r>
+              <w:t xml:space="preserve">voi, pas de RX </w:t>
+            </w:r>
+            <w:proofErr w:type="spellStart"/>
+            <w:r>
+              <w:t>apres</w:t>
+            </w:r>
+            <w:proofErr w:type="spellEnd"/>
+            <w:r>
+              <w:t xml:space="preserve">) </w:t>
+            </w:r>
+            <w:proofErr w:type="spellStart"/>
+            <w:r>
+              <w:t>Cla</w:t>
+            </w:r>
+            <w:proofErr w:type="spellEnd"/>
+            <w:proofErr w:type="gramStart"/>
+            <w:r>
+              <w:t> :A</w:t>
+            </w:r>
+            <w:proofErr w:type="gramEnd"/>
+            <w:r>
+              <w:t xml:space="preserve">     </w:t>
+            </w:r>
+          </w:p>
+        </w:tc>
+        <w:tc>
+          <w:tcPr>
+            <w:tcW w:w="2835" w:type="dxa"/>
+          </w:tcPr>
+          <w:p>
+            <w:r>
+              <w:t>Ok 12-33-46 –T0</w:t>
+            </w:r>
+          </w:p>
+        </w:tc>
+      </w:tr>
+      <w:tr>
+        <w:tc>
+          <w:tcPr>
+            <w:tcW w:w="2547" w:type="dxa"/>
+          </w:tcPr>
+          <w:p>
+            <w:r>
+              <w:t>En RX</w:t>
+            </w:r>
+          </w:p>
+        </w:tc>
+        <w:tc>
+          <w:tcPr>
+            <w:tcW w:w="4394" w:type="dxa"/>
+          </w:tcPr>
+          <w:p>
+            <w:r>
+              <w:t xml:space="preserve">ABBB (0x00 : </w:t>
+            </w:r>
+            <w:proofErr w:type="spellStart"/>
+            <w:r>
+              <w:t>Ack</w:t>
+            </w:r>
+            <w:proofErr w:type="spellEnd"/>
+            <w:r>
+              <w:t>, pas de ren</w:t>
+            </w:r>
+            <w:r>
+              <w:t xml:space="preserve">voi, pas de RX </w:t>
+            </w:r>
+            <w:proofErr w:type="spellStart"/>
+            <w:r>
+              <w:t>apres</w:t>
+            </w:r>
+            <w:proofErr w:type="spellEnd"/>
+            <w:r>
+              <w:t xml:space="preserve">) </w:t>
+            </w:r>
+            <w:proofErr w:type="spellStart"/>
+            <w:r>
+              <w:t>Cla</w:t>
+            </w:r>
+            <w:proofErr w:type="spellEnd"/>
+            <w:proofErr w:type="gramStart"/>
+            <w:r>
+              <w:t> :A</w:t>
+            </w:r>
+            <w:proofErr w:type="gramEnd"/>
+            <w:r>
+              <w:t xml:space="preserve">     </w:t>
+            </w:r>
+          </w:p>
+        </w:tc>
+        <w:tc>
+          <w:tcPr>
+            <w:tcW w:w="2835" w:type="dxa"/>
+          </w:tcPr>
+          <w:p>
+            <w:r>
+              <w:t>12-33-46</w:t>
+            </w:r>
+            <w:r>
+              <w:t>-50</w:t>
+            </w:r>
+            <w:r>
+              <w:t xml:space="preserve"> </w:t>
+            </w:r>
+          </w:p>
+          <w:p>
+            <w:proofErr w:type="spellStart"/>
+            <w:proofErr w:type="gramStart"/>
+            <w:r>
+              <w:rPr>
+                <w:rFonts w:ascii="Consolas" w:hAnsi="Consolas"/>
+                <w:b/>
+                <w:bCs/>
+                <w:color w:val="000000"/>
+                <w:sz w:val="20"/>
+                <w:szCs w:val="20"/>
+                <w:shd w:val="clear" w:color="auto" w:fill="FFFFFF"/>
+              </w:rPr>
+              <w:t>lora</w:t>
+            </w:r>
+            <w:proofErr w:type="gramEnd"/>
+            <w:r>
+              <w:rPr>
+                <w:rFonts w:ascii="Consolas" w:hAnsi="Consolas"/>
+                <w:b/>
+                <w:bCs/>
+                <w:color w:val="000000"/>
+                <w:sz w:val="20"/>
+                <w:szCs w:val="20"/>
+                <w:shd w:val="clear" w:color="auto" w:fill="FFFFFF"/>
+              </w:rPr>
+              <w:t>_timer_tx</w:t>
+            </w:r>
+            <w:proofErr w:type="spellEnd"/>
+          </w:p>
+        </w:tc>
+      </w:tr>
+      <w:tr>
+        <w:tc>
+          <w:tcPr>
+            <w:tcW w:w="2547" w:type="dxa"/>
+          </w:tcPr>
+          <w:p>
+            <w:r>
+              <w:t>En RX</w:t>
+            </w:r>
+          </w:p>
+        </w:tc>
+        <w:tc>
+          <w:tcPr>
+            <w:tcW w:w="4394" w:type="dxa"/>
+          </w:tcPr>
+          <w:p>
+            <w:r>
+              <w:t>ABBB (0x</w:t>
+            </w:r>
+            <w:r>
+              <w:t>20</w:t>
+            </w:r>
+            <w:r>
+              <w:t xml:space="preserve"> : </w:t>
+            </w:r>
+            <w:proofErr w:type="spellStart"/>
+            <w:r>
+              <w:t>Ack</w:t>
+            </w:r>
+            <w:proofErr w:type="spellEnd"/>
+            <w:r>
+              <w:t xml:space="preserve">, </w:t>
+            </w:r>
+            <w:r>
+              <w:t>pas de</w:t>
+            </w:r>
+            <w:r>
+              <w:t xml:space="preserve"> ren</w:t>
+            </w:r>
+            <w:r>
+              <w:t xml:space="preserve">voi, RX </w:t>
+            </w:r>
+            <w:proofErr w:type="spellStart"/>
+            <w:r>
+              <w:t>apres</w:t>
+            </w:r>
+            <w:proofErr w:type="spellEnd"/>
+            <w:r>
+              <w:t xml:space="preserve">) </w:t>
+            </w:r>
+            <w:proofErr w:type="spellStart"/>
+            <w:r>
+              <w:t>Cla</w:t>
+            </w:r>
+            <w:proofErr w:type="spellEnd"/>
+            <w:proofErr w:type="gramStart"/>
+            <w:r>
+              <w:t> :A</w:t>
+            </w:r>
+            <w:proofErr w:type="gramEnd"/>
+            <w:r>
+              <w:t xml:space="preserve">     </w:t>
+            </w:r>
+          </w:p>
+        </w:tc>
+        <w:tc>
+          <w:tcPr>
+            <w:tcW w:w="2835" w:type="dxa"/>
+          </w:tcPr>
+          <w:p>
+            <w:r>
+              <w:t xml:space="preserve"> 12-33-46-57</w:t>
+            </w:r>
+          </w:p>
+          <w:p>
+            <w:proofErr w:type="spellStart"/>
+            <w:r>
+              <w:t>Lora_timer_tx</w:t>
+            </w:r>
+            <w:proofErr w:type="spellEnd"/>
+          </w:p>
+          <w:p>
+            <w:r>
+              <w:t xml:space="preserve">Timeout Lora RA </w:t>
+            </w:r>
+            <w:proofErr w:type="spellStart"/>
+            <w:r>
+              <w:t>g_rx</w:t>
+            </w:r>
+            <w:proofErr w:type="spellEnd"/>
+            <w:r>
+              <w:t>=2</w:t>
+            </w:r>
+          </w:p>
+        </w:tc>
+      </w:tr>
+      <w:tr>
+        <w:tc>
+          <w:tcPr>
+            <w:tcW w:w="2547" w:type="dxa"/>
+          </w:tcPr>
+          <w:p>
+            <w:r>
+              <w:t>1) USLO (0x10)</w:t>
+            </w:r>
+          </w:p>
+        </w:tc>
+        <w:tc>
+          <w:tcPr>
+            <w:tcW w:w="4394" w:type="dxa"/>
+          </w:tcPr>
+          <w:p>
+            <w:r>
+              <w:t>2)ABBB (0x30)</w:t>
+            </w:r>
+          </w:p>
+        </w:tc>
+        <w:tc>
+          <w:tcPr>
+            <w:tcW w:w="2835" w:type="dxa"/>
+          </w:tcPr>
+          <w:p>
+            <w:pPr>
+              <w:rPr>
+                <w:lang w:val="en-US"/>
+              </w:rPr>
+            </w:pPr>
+            <w:proofErr w:type="gramStart"/>
+            <w:r>
+              <w:rPr>
+                <w:lang w:val="en-US"/>
+              </w:rPr>
+              <w:t>End :</w:t>
+            </w:r>
+            <w:proofErr w:type="gramEnd"/>
+            <w:r>
+              <w:rPr>
+                <w:lang w:val="en-US"/>
+              </w:rPr>
+              <w:t xml:space="preserve"> 12-33-47</w:t>
+            </w:r>
+          </w:p>
+          <w:p>
+            <w:pPr>
+              <w:rPr>
+                <w:lang w:val="en-US"/>
+              </w:rPr>
+            </w:pPr>
+            <w:proofErr w:type="gramStart"/>
+            <w:r>
+              <w:rPr>
+                <w:lang w:val="en-US"/>
+              </w:rPr>
+              <w:t>Conc :</w:t>
+            </w:r>
+            <w:proofErr w:type="gramEnd"/>
+            <w:r>
+              <w:rPr>
+                <w:lang w:val="en-US"/>
+              </w:rPr>
+              <w:t xml:space="preserve"> 02-33-40</w:t>
+            </w:r>
+          </w:p>
+          <w:p>
+            <w:pPr>
+              <w:rPr>
+                <w:lang w:val="en-US"/>
+              </w:rPr>
+            </w:pPr>
+            <w:proofErr w:type="gramStart"/>
+            <w:r>
+              <w:rPr>
+                <w:lang w:val="en-US"/>
+              </w:rPr>
+              <w:t>End :</w:t>
+            </w:r>
+            <w:proofErr w:type="spellStart"/>
+            <w:r>
+              <w:rPr>
+                <w:lang w:val="en-US"/>
+              </w:rPr>
+              <w:t>plante</w:t>
+            </w:r>
+            <w:proofErr w:type="spellEnd"/>
+            <w:proofErr w:type="gramEnd"/>
+            <w:r>
+              <w:rPr>
+                <w:lang w:val="en-US"/>
+              </w:rPr>
+              <w:t xml:space="preserve"> </w:t>
+            </w:r>
+            <w:proofErr w:type="spellStart"/>
+            <w:r>
+              <w:rPr>
+                <w:lang w:val="en-US"/>
+              </w:rPr>
+              <w:t>recep</w:t>
+            </w:r>
+            <w:proofErr w:type="spellEnd"/>
+            <w:r>
+              <w:rPr>
+                <w:lang w:val="en-US"/>
+              </w:rPr>
+              <w:t xml:space="preserve"> mess</w:t>
+            </w:r>
           </w:p>
         </w:tc>
       </w:tr>
@@ -1767,7 +1865,6 @@
         <w:spacing w:after="0" w:line="240" w:lineRule="auto"/>
       </w:pPr>
       <w:r>
-        <w:lastRenderedPageBreak/>
         <w:t xml:space="preserve">0x22 : </w:t>
       </w:r>
       <w:proofErr w:type="spellStart"/>
@@ -1789,6 +1886,7 @@
         <w:spacing w:after="0" w:line="240" w:lineRule="auto"/>
       </w:pPr>
       <w:r>
+        <w:lastRenderedPageBreak/>
         <w:t xml:space="preserve">0x24 : </w:t>
       </w:r>
       <w:proofErr w:type="spellStart"/>
@@ -1815,16 +1913,238 @@
         <w:spacing w:after="0" w:line="240" w:lineRule="auto"/>
       </w:pPr>
       <w:r>
-        <w:t xml:space="preserve">Message </w:t>
-      </w:r>
-      <w:proofErr w:type="spellStart"/>
-      <w:r>
-        <w:t>recu</w:t>
-      </w:r>
-      <w:proofErr w:type="spellEnd"/>
-      <w:r>
-        <w:t xml:space="preserve"> par concentrateur : </w:t>
-      </w:r>
+        <w:t xml:space="preserve">Portée : </w:t>
+      </w:r>
+    </w:p>
+    <w:tbl>
+      <w:tblPr>
+        <w:tblStyle w:val="Grilledutableau"/>
+        <w:tblW w:w="0" w:type="auto"/>
+        <w:tblLook w:val="04A0" w:firstRow="1" w:lastRow="0" w:firstColumn="1" w:lastColumn="0" w:noHBand="0" w:noVBand="1"/>
+      </w:tblPr>
+      <w:tblGrid>
+        <w:gridCol w:w="2265"/>
+        <w:gridCol w:w="2265"/>
+        <w:gridCol w:w="2266"/>
+        <w:gridCol w:w="2266"/>
+      </w:tblGrid>
+      <w:tr>
+        <w:tc>
+          <w:tcPr>
+            <w:tcW w:w="2265" w:type="dxa"/>
+          </w:tcPr>
+          <w:p/>
+        </w:tc>
+        <w:tc>
+          <w:tcPr>
+            <w:tcW w:w="2265" w:type="dxa"/>
+          </w:tcPr>
+          <w:p>
+            <w:r>
+              <w:t>TX</w:t>
+            </w:r>
+          </w:p>
+        </w:tc>
+        <w:tc>
+          <w:tcPr>
+            <w:tcW w:w="2266" w:type="dxa"/>
+          </w:tcPr>
+          <w:p/>
+        </w:tc>
+        <w:tc>
+          <w:tcPr>
+            <w:tcW w:w="2266" w:type="dxa"/>
+          </w:tcPr>
+          <w:p/>
+        </w:tc>
+      </w:tr>
+      <w:tr>
+        <w:tc>
+          <w:tcPr>
+            <w:tcW w:w="2265" w:type="dxa"/>
+          </w:tcPr>
+          <w:p/>
+        </w:tc>
+        <w:tc>
+          <w:tcPr>
+            <w:tcW w:w="2265" w:type="dxa"/>
+          </w:tcPr>
+          <w:p/>
+        </w:tc>
+        <w:tc>
+          <w:tcPr>
+            <w:tcW w:w="2266" w:type="dxa"/>
+          </w:tcPr>
+          <w:p/>
+        </w:tc>
+        <w:tc>
+          <w:tcPr>
+            <w:tcW w:w="2266" w:type="dxa"/>
+          </w:tcPr>
+          <w:p/>
+        </w:tc>
+      </w:tr>
+      <w:tr>
+        <w:tc>
+          <w:tcPr>
+            <w:tcW w:w="2265" w:type="dxa"/>
+          </w:tcPr>
+          <w:p/>
+        </w:tc>
+        <w:tc>
+          <w:tcPr>
+            <w:tcW w:w="2265" w:type="dxa"/>
+          </w:tcPr>
+          <w:p/>
+        </w:tc>
+        <w:tc>
+          <w:tcPr>
+            <w:tcW w:w="2266" w:type="dxa"/>
+          </w:tcPr>
+          <w:p/>
+        </w:tc>
+        <w:tc>
+          <w:tcPr>
+            <w:tcW w:w="2266" w:type="dxa"/>
+          </w:tcPr>
+          <w:p/>
+        </w:tc>
+      </w:tr>
+      <w:tr>
+        <w:tc>
+          <w:tcPr>
+            <w:tcW w:w="2265" w:type="dxa"/>
+          </w:tcPr>
+          <w:p/>
+        </w:tc>
+        <w:tc>
+          <w:tcPr>
+            <w:tcW w:w="2265" w:type="dxa"/>
+          </w:tcPr>
+          <w:p/>
+        </w:tc>
+        <w:tc>
+          <w:tcPr>
+            <w:tcW w:w="2266" w:type="dxa"/>
+          </w:tcPr>
+          <w:p/>
+        </w:tc>
+        <w:tc>
+          <w:tcPr>
+            <w:tcW w:w="2266" w:type="dxa"/>
+          </w:tcPr>
+          <w:p/>
+        </w:tc>
+      </w:tr>
+      <w:tr>
+        <w:tc>
+          <w:tcPr>
+            <w:tcW w:w="2265" w:type="dxa"/>
+          </w:tcPr>
+          <w:p/>
+        </w:tc>
+        <w:tc>
+          <w:tcPr>
+            <w:tcW w:w="2265" w:type="dxa"/>
+          </w:tcPr>
+          <w:p/>
+        </w:tc>
+        <w:tc>
+          <w:tcPr>
+            <w:tcW w:w="2266" w:type="dxa"/>
+          </w:tcPr>
+          <w:p/>
+        </w:tc>
+        <w:tc>
+          <w:tcPr>
+            <w:tcW w:w="2266" w:type="dxa"/>
+          </w:tcPr>
+          <w:p/>
+        </w:tc>
+      </w:tr>
+      <w:tr>
+        <w:tc>
+          <w:tcPr>
+            <w:tcW w:w="2265" w:type="dxa"/>
+          </w:tcPr>
+          <w:p/>
+        </w:tc>
+        <w:tc>
+          <w:tcPr>
+            <w:tcW w:w="2265" w:type="dxa"/>
+          </w:tcPr>
+          <w:p/>
+        </w:tc>
+        <w:tc>
+          <w:tcPr>
+            <w:tcW w:w="2266" w:type="dxa"/>
+          </w:tcPr>
+          <w:p/>
+        </w:tc>
+        <w:tc>
+          <w:tcPr>
+            <w:tcW w:w="2266" w:type="dxa"/>
+          </w:tcPr>
+          <w:p/>
+        </w:tc>
+      </w:tr>
+      <w:tr>
+        <w:tc>
+          <w:tcPr>
+            <w:tcW w:w="2265" w:type="dxa"/>
+          </w:tcPr>
+          <w:p/>
+        </w:tc>
+        <w:tc>
+          <w:tcPr>
+            <w:tcW w:w="2265" w:type="dxa"/>
+          </w:tcPr>
+          <w:p/>
+        </w:tc>
+        <w:tc>
+          <w:tcPr>
+            <w:tcW w:w="2266" w:type="dxa"/>
+          </w:tcPr>
+          <w:p/>
+        </w:tc>
+        <w:tc>
+          <w:tcPr>
+            <w:tcW w:w="2266" w:type="dxa"/>
+          </w:tcPr>
+          <w:p/>
+        </w:tc>
+      </w:tr>
+      <w:tr>
+        <w:tc>
+          <w:tcPr>
+            <w:tcW w:w="2265" w:type="dxa"/>
+          </w:tcPr>
+          <w:p/>
+        </w:tc>
+        <w:tc>
+          <w:tcPr>
+            <w:tcW w:w="2265" w:type="dxa"/>
+          </w:tcPr>
+          <w:p/>
+        </w:tc>
+        <w:tc>
+          <w:tcPr>
+            <w:tcW w:w="2266" w:type="dxa"/>
+          </w:tcPr>
+          <w:p/>
+        </w:tc>
+        <w:tc>
+          <w:tcPr>
+            <w:tcW w:w="2266" w:type="dxa"/>
+          </w:tcPr>
+          <w:p/>
+        </w:tc>
+      </w:tr>
+    </w:tbl>
+    <w:p>
+      <w:pPr>
+        <w:spacing w:after="0" w:line="240" w:lineRule="auto"/>
+      </w:pPr>
     </w:p>
     <w:p>
       <w:pPr>

</xml_diff>

<commit_message>
ops lora, bug hal_delay, led
</commit_message>
<xml_diff>
--- a/test_lora.docx
+++ b/test_lora.docx
@@ -275,85 +275,236 @@
               <w:t>En RX</w:t>
             </w:r>
             <w:r>
-              <w:t xml:space="preserve"> ou</w:t>
+              <w:t xml:space="preserve"> </w:t>
+            </w:r>
+          </w:p>
+        </w:tc>
+        <w:tc>
+          <w:tcPr>
+            <w:tcW w:w="4394" w:type="dxa"/>
+          </w:tcPr>
+          <w:p>
+            <w:r>
+              <w:t>ABBB (0x30</w:t>
+            </w:r>
+            <w:proofErr w:type="gramStart"/>
+            <w:r>
+              <w:t> :</w:t>
+            </w:r>
+            <w:proofErr w:type="spellStart"/>
+            <w:r>
+              <w:t>Pasd’ack</w:t>
+            </w:r>
+            <w:proofErr w:type="spellEnd"/>
+            <w:proofErr w:type="gramEnd"/>
+            <w:r>
+              <w:t xml:space="preserve">, </w:t>
+            </w:r>
+            <w:proofErr w:type="spellStart"/>
+            <w:r>
+              <w:t>RXapres</w:t>
+            </w:r>
+            <w:proofErr w:type="spellEnd"/>
+            <w:r>
+              <w:t>)</w:t>
+            </w:r>
+          </w:p>
+        </w:tc>
+        <w:tc>
+          <w:tcPr>
+            <w:tcW w:w="2835" w:type="dxa"/>
+          </w:tcPr>
+          <w:p>
+            <w:proofErr w:type="gramStart"/>
+            <w:r>
+              <w:t>ok</w:t>
+            </w:r>
+            <w:proofErr w:type="gramEnd"/>
+            <w:r>
+              <w:t xml:space="preserve"> 12-33-47 </w:t>
+            </w:r>
+            <w:r>
+              <w:t>puis RX reçu</w:t>
+            </w:r>
+          </w:p>
+          <w:p>
+            <w:proofErr w:type="spellStart"/>
+            <w:r>
+              <w:t>Timer</w:t>
+            </w:r>
+            <w:proofErr w:type="spellEnd"/>
+            <w:r>
+              <w:t xml:space="preserve"> </w:t>
+            </w:r>
+            <w:proofErr w:type="spellStart"/>
+            <w:r>
+              <w:t>lora</w:t>
+            </w:r>
+            <w:proofErr w:type="spellEnd"/>
+            <w:r>
+              <w:t xml:space="preserve"> </w:t>
+            </w:r>
+            <w:proofErr w:type="spellStart"/>
+            <w:r>
+              <w:t>tx</w:t>
+            </w:r>
+            <w:proofErr w:type="spellEnd"/>
+          </w:p>
+        </w:tc>
+      </w:tr>
+      <w:tr>
+        <w:tc>
+          <w:tcPr>
+            <w:tcW w:w="2547" w:type="dxa"/>
+          </w:tcPr>
+          <w:p>
+            <w:r>
+              <w:t>En RX</w:t>
+            </w:r>
+            <w:r>
+              <w:t xml:space="preserve">  1</w:t>
+            </w:r>
+            <w:proofErr w:type="gramStart"/>
+            <w:r>
+              <w:t> :UABC</w:t>
+            </w:r>
+            <w:proofErr w:type="gramEnd"/>
+          </w:p>
+        </w:tc>
+        <w:tc>
+          <w:tcPr>
+            <w:tcW w:w="4394" w:type="dxa"/>
+          </w:tcPr>
+          <w:p>
+            <w:r>
+              <w:t>2</w:t>
+            </w:r>
+            <w:proofErr w:type="gramStart"/>
+            <w:r>
+              <w:t> :ABBB</w:t>
+            </w:r>
+            <w:proofErr w:type="gramEnd"/>
+            <w:r>
+              <w:t>(0x30)</w:t>
+            </w:r>
+          </w:p>
+        </w:tc>
+        <w:tc>
+          <w:tcPr>
+            <w:tcW w:w="2835" w:type="dxa"/>
+          </w:tcPr>
+          <w:p/>
+        </w:tc>
+      </w:tr>
+      <w:tr>
+        <w:tc>
+          <w:tcPr>
+            <w:tcW w:w="2547" w:type="dxa"/>
+          </w:tcPr>
+          <w:p>
+            <w:r>
+              <w:t>En RX</w:t>
+            </w:r>
+          </w:p>
+        </w:tc>
+        <w:tc>
+          <w:tcPr>
+            <w:tcW w:w="4394" w:type="dxa"/>
+          </w:tcPr>
+          <w:p>
+            <w:r>
+              <w:t>HSLO (0x30</w:t>
+            </w:r>
+            <w:proofErr w:type="gramStart"/>
+            <w:r>
+              <w:t> :Pas</w:t>
+            </w:r>
+            <w:proofErr w:type="gramEnd"/>
+            <w:r>
+              <w:t xml:space="preserve"> d’</w:t>
+            </w:r>
+            <w:proofErr w:type="spellStart"/>
+            <w:r>
+              <w:t>ack</w:t>
+            </w:r>
+            <w:proofErr w:type="spellEnd"/>
+            <w:r>
+              <w:t xml:space="preserve">, RX </w:t>
+            </w:r>
+            <w:proofErr w:type="spellStart"/>
+            <w:r>
+              <w:t>apres</w:t>
+            </w:r>
+            <w:proofErr w:type="spellEnd"/>
+            <w:r>
+              <w:t>)</w:t>
+            </w:r>
+          </w:p>
+        </w:tc>
+        <w:tc>
+          <w:tcPr>
+            <w:tcW w:w="2835" w:type="dxa"/>
+          </w:tcPr>
+          <w:p>
+            <w:r>
+              <w:t>End :12-33-47</w:t>
+            </w:r>
+          </w:p>
+          <w:p>
+            <w:r>
+              <w:t>Conc</w:t>
+            </w:r>
+            <w:proofErr w:type="gramStart"/>
+            <w:r>
+              <w:t> :Rx</w:t>
+            </w:r>
+            <w:proofErr w:type="gramEnd"/>
+            <w:r>
+              <w:t>-02-22-33-47-T0</w:t>
+            </w:r>
+          </w:p>
+        </w:tc>
+      </w:tr>
+      <w:tr>
+        <w:tc>
+          <w:tcPr>
+            <w:tcW w:w="2547" w:type="dxa"/>
+          </w:tcPr>
+          <w:p/>
+        </w:tc>
+        <w:tc>
+          <w:tcPr>
+            <w:tcW w:w="4394" w:type="dxa"/>
+          </w:tcPr>
+          <w:p>
+            <w:r>
+              <w:t>Idem HSLO</w:t>
+            </w:r>
+          </w:p>
+        </w:tc>
+        <w:tc>
+          <w:tcPr>
+            <w:tcW w:w="2835" w:type="dxa"/>
+          </w:tcPr>
+          <w:p>
+            <w:r>
+              <w:t xml:space="preserve">End : 12-33-47 </w:t>
+            </w:r>
+            <w:proofErr w:type="spellStart"/>
+            <w:r>
+              <w:t>Rx</w:t>
+            </w:r>
+            <w:proofErr w:type="spellEnd"/>
+            <w:r>
+              <w:t xml:space="preserve"> 00</w:t>
+            </w:r>
+          </w:p>
+          <w:p>
+            <w:r>
+              <w:t>Conc : Rx-02-33-47</w:t>
             </w:r>
             <w:bookmarkStart w:id="0" w:name="_GoBack"/>
             <w:bookmarkEnd w:id="0"/>
-            <w:r>
-              <w:t xml:space="preserve"> 1 :UABC</w:t>
-            </w:r>
-          </w:p>
-        </w:tc>
-        <w:tc>
-          <w:tcPr>
-            <w:tcW w:w="4394" w:type="dxa"/>
-          </w:tcPr>
-          <w:p>
-            <w:r>
-              <w:t>ABBB (0x30</w:t>
-            </w:r>
-            <w:proofErr w:type="gramStart"/>
-            <w:r>
-              <w:t> :</w:t>
-            </w:r>
-            <w:proofErr w:type="spellStart"/>
-            <w:r>
-              <w:t>Pasd’ack</w:t>
-            </w:r>
-            <w:proofErr w:type="spellEnd"/>
-            <w:proofErr w:type="gramEnd"/>
-            <w:r>
-              <w:t xml:space="preserve">, </w:t>
-            </w:r>
-            <w:proofErr w:type="spellStart"/>
-            <w:r>
-              <w:t>RXapres</w:t>
-            </w:r>
-            <w:proofErr w:type="spellEnd"/>
-            <w:r>
-              <w:t>)</w:t>
-            </w:r>
-          </w:p>
-        </w:tc>
-        <w:tc>
-          <w:tcPr>
-            <w:tcW w:w="2835" w:type="dxa"/>
-          </w:tcPr>
-          <w:p>
-            <w:proofErr w:type="gramStart"/>
-            <w:r>
-              <w:t>ok</w:t>
-            </w:r>
-            <w:proofErr w:type="gramEnd"/>
-            <w:r>
-              <w:t xml:space="preserve"> 12-33-47 </w:t>
-            </w:r>
-            <w:r>
-              <w:t>puis RX reçu</w:t>
-            </w:r>
-          </w:p>
-          <w:p>
-            <w:proofErr w:type="spellStart"/>
-            <w:r>
-              <w:t>Timer</w:t>
-            </w:r>
-            <w:proofErr w:type="spellEnd"/>
-            <w:r>
-              <w:t xml:space="preserve"> </w:t>
-            </w:r>
-            <w:proofErr w:type="spellStart"/>
-            <w:r>
-              <w:t>lora</w:t>
-            </w:r>
-            <w:proofErr w:type="spellEnd"/>
-            <w:r>
-              <w:t xml:space="preserve"> </w:t>
-            </w:r>
-            <w:proofErr w:type="spellStart"/>
-            <w:r>
-              <w:t>tx</w:t>
-            </w:r>
-            <w:proofErr w:type="spellEnd"/>
           </w:p>
         </w:tc>
       </w:tr>
@@ -683,6 +834,12 @@
               </w:rPr>
               <w:t xml:space="preserve"> 02-33-40</w:t>
             </w:r>
+            <w:r>
+              <w:rPr>
+                <w:lang w:val="en-US"/>
+              </w:rPr>
+              <w:t xml:space="preserve">   00</w:t>
+            </w:r>
           </w:p>
           <w:p>
             <w:pPr>
@@ -695,37 +852,22 @@
               <w:rPr>
                 <w:lang w:val="en-US"/>
               </w:rPr>
-              <w:t>End :</w:t>
-            </w:r>
-            <w:proofErr w:type="spellStart"/>
+              <w:t>End :</w:t>
+            </w:r>
+            <w:proofErr w:type="gramEnd"/>
             <w:r>
               <w:rPr>
                 <w:lang w:val="en-US"/>
               </w:rPr>
-              <w:t>plante</w:t>
-            </w:r>
-            <w:proofErr w:type="spellEnd"/>
-            <w:proofErr w:type="gramEnd"/>
-            <w:r>
+              <w:t xml:space="preserve"> 12-33-47</w:t>
+            </w:r>
+          </w:p>
+          <w:p>
+            <w:pPr>
               <w:rPr>
                 <w:lang w:val="en-US"/>
               </w:rPr>
-              <w:t xml:space="preserve"> </w:t>
-            </w:r>
-            <w:proofErr w:type="spellStart"/>
-            <w:r>
-              <w:rPr>
-                <w:lang w:val="en-US"/>
-              </w:rPr>
-              <w:t>recep</w:t>
-            </w:r>
-            <w:proofErr w:type="spellEnd"/>
-            <w:r>
-              <w:rPr>
-                <w:lang w:val="en-US"/>
-              </w:rPr>
-              <w:t xml:space="preserve"> mess</w:t>
-            </w:r>
+            </w:pPr>
           </w:p>
         </w:tc>
       </w:tr>
@@ -746,23 +888,30 @@
           </w:tcPr>
           <w:p>
             <w:r>
-              <w:t>HSLO (0x30</w:t>
-            </w:r>
-            <w:proofErr w:type="gramStart"/>
-            <w:r>
-              <w:t> :Pas</w:t>
-            </w:r>
-            <w:proofErr w:type="gramEnd"/>
-            <w:r>
-              <w:t xml:space="preserve"> d’</w:t>
-            </w:r>
-            <w:proofErr w:type="spellStart"/>
-            <w:r>
-              <w:t>ack</w:t>
-            </w:r>
-            <w:proofErr w:type="spellEnd"/>
-            <w:r>
-              <w:t xml:space="preserve">, RX </w:t>
+              <w:t>ABBB (0x0</w:t>
+            </w:r>
+            <w:r>
+              <w:t>2</w:t>
+            </w:r>
+            <w:r>
+              <w:t xml:space="preserve"> : </w:t>
+            </w:r>
+            <w:proofErr w:type="spellStart"/>
+            <w:r>
+              <w:t>Ack</w:t>
+            </w:r>
+            <w:proofErr w:type="spellEnd"/>
+            <w:r>
+              <w:t xml:space="preserve">, </w:t>
+            </w:r>
+            <w:r>
+              <w:t>1</w:t>
+            </w:r>
+            <w:r>
+              <w:t xml:space="preserve"> ren</w:t>
+            </w:r>
+            <w:r>
+              <w:t xml:space="preserve">voi, pas de RX </w:t>
             </w:r>
             <w:proofErr w:type="spellStart"/>
             <w:r>
@@ -770,7 +919,20 @@
             </w:r>
             <w:proofErr w:type="spellEnd"/>
             <w:r>
-              <w:t>)</w:t>
+              <w:t xml:space="preserve">) </w:t>
+            </w:r>
+            <w:proofErr w:type="spellStart"/>
+            <w:r>
+              <w:t>Cla</w:t>
+            </w:r>
+            <w:proofErr w:type="spellEnd"/>
+            <w:proofErr w:type="gramStart"/>
+            <w:r>
+              <w:t> :A</w:t>
+            </w:r>
+            <w:proofErr w:type="gramEnd"/>
+            <w:r>
+              <w:t xml:space="preserve">     </w:t>
             </w:r>
           </w:p>
         </w:tc>
@@ -778,7 +940,13 @@
           <w:tcPr>
             <w:tcW w:w="2835" w:type="dxa"/>
           </w:tcPr>
-          <w:p/>
+          <w:p>
+            <w:proofErr w:type="gramStart"/>
+            <w:r>
+              <w:t>ok</w:t>
+            </w:r>
+            <w:proofErr w:type="gramEnd"/>
+          </w:p>
         </w:tc>
       </w:tr>
       <w:tr>
@@ -788,6 +956,78 @@
           </w:tcPr>
           <w:p>
             <w:r>
+              <w:t>Pas en RX (débranché)</w:t>
+            </w:r>
+          </w:p>
+        </w:tc>
+        <w:tc>
+          <w:tcPr>
+            <w:tcW w:w="4394" w:type="dxa"/>
+          </w:tcPr>
+          <w:p>
+            <w:r>
+              <w:t>ABBB (0x0</w:t>
+            </w:r>
+            <w:r>
+              <w:t>2</w:t>
+            </w:r>
+            <w:r>
+              <w:t xml:space="preserve"> : </w:t>
+            </w:r>
+            <w:proofErr w:type="spellStart"/>
+            <w:r>
+              <w:t>Ack</w:t>
+            </w:r>
+            <w:proofErr w:type="spellEnd"/>
+            <w:r>
+              <w:t xml:space="preserve">, </w:t>
+            </w:r>
+            <w:r>
+              <w:t>1</w:t>
+            </w:r>
+            <w:r>
+              <w:t xml:space="preserve"> ren</w:t>
+            </w:r>
+            <w:r>
+              <w:t xml:space="preserve">voi, pas de RX </w:t>
+            </w:r>
+            <w:proofErr w:type="spellStart"/>
+            <w:r>
+              <w:t>apres</w:t>
+            </w:r>
+            <w:proofErr w:type="spellEnd"/>
+            <w:r>
+              <w:t xml:space="preserve">) </w:t>
+            </w:r>
+            <w:proofErr w:type="spellStart"/>
+            <w:r>
+              <w:t>Cla</w:t>
+            </w:r>
+            <w:proofErr w:type="spellEnd"/>
+            <w:proofErr w:type="gramStart"/>
+            <w:r>
+              <w:t> :A</w:t>
+            </w:r>
+            <w:proofErr w:type="gramEnd"/>
+            <w:r>
+              <w:t xml:space="preserve">     </w:t>
+            </w:r>
+          </w:p>
+        </w:tc>
+        <w:tc>
+          <w:tcPr>
+            <w:tcW w:w="2835" w:type="dxa"/>
+          </w:tcPr>
+          <w:p/>
+        </w:tc>
+      </w:tr>
+      <w:tr>
+        <w:tc>
+          <w:tcPr>
+            <w:tcW w:w="2547" w:type="dxa"/>
+          </w:tcPr>
+          <w:p>
+            <w:r>
               <w:t>En RX</w:t>
             </w:r>
           </w:p>
@@ -801,7 +1041,7 @@
               <w:t>ABBB (0x0</w:t>
             </w:r>
             <w:r>
-              <w:t>2</w:t>
+              <w:t>4</w:t>
             </w:r>
             <w:r>
               <w:t xml:space="preserve"> : </w:t>
@@ -815,13 +1055,229 @@
               <w:t xml:space="preserve">, </w:t>
             </w:r>
             <w:r>
+              <w:t>3</w:t>
+            </w:r>
+            <w:r>
+              <w:t xml:space="preserve"> ren</w:t>
+            </w:r>
+            <w:r>
+              <w:t xml:space="preserve">voi, pas de RX </w:t>
+            </w:r>
+            <w:proofErr w:type="spellStart"/>
+            <w:r>
+              <w:t>apres</w:t>
+            </w:r>
+            <w:proofErr w:type="spellEnd"/>
+            <w:r>
+              <w:t xml:space="preserve">) </w:t>
+            </w:r>
+            <w:proofErr w:type="spellStart"/>
+            <w:r>
+              <w:t>Cla</w:t>
+            </w:r>
+            <w:proofErr w:type="spellEnd"/>
+            <w:proofErr w:type="gramStart"/>
+            <w:r>
+              <w:t> :A</w:t>
+            </w:r>
+            <w:proofErr w:type="gramEnd"/>
+            <w:r>
+              <w:t xml:space="preserve">     </w:t>
+            </w:r>
+          </w:p>
+        </w:tc>
+        <w:tc>
+          <w:tcPr>
+            <w:tcW w:w="2835" w:type="dxa"/>
+          </w:tcPr>
+          <w:p/>
+        </w:tc>
+      </w:tr>
+      <w:tr>
+        <w:tc>
+          <w:tcPr>
+            <w:tcW w:w="2547" w:type="dxa"/>
+          </w:tcPr>
+          <w:p>
+            <w:r>
+              <w:t>Pas en RX (débranché)</w:t>
+            </w:r>
+          </w:p>
+        </w:tc>
+        <w:tc>
+          <w:tcPr>
+            <w:tcW w:w="4394" w:type="dxa"/>
+          </w:tcPr>
+          <w:p>
+            <w:r>
+              <w:t>ABBB (0x0</w:t>
+            </w:r>
+            <w:r>
+              <w:t>4</w:t>
+            </w:r>
+            <w:r>
+              <w:t xml:space="preserve"> : </w:t>
+            </w:r>
+            <w:proofErr w:type="spellStart"/>
+            <w:r>
+              <w:t>Ack</w:t>
+            </w:r>
+            <w:proofErr w:type="spellEnd"/>
+            <w:r>
+              <w:t xml:space="preserve">, </w:t>
+            </w:r>
+            <w:r>
+              <w:t>3</w:t>
+            </w:r>
+            <w:r>
+              <w:t xml:space="preserve"> ren</w:t>
+            </w:r>
+            <w:r>
+              <w:t xml:space="preserve">voi, pas de RX </w:t>
+            </w:r>
+            <w:proofErr w:type="spellStart"/>
+            <w:r>
+              <w:t>apres</w:t>
+            </w:r>
+            <w:proofErr w:type="spellEnd"/>
+            <w:r>
+              <w:t xml:space="preserve">) </w:t>
+            </w:r>
+            <w:proofErr w:type="spellStart"/>
+            <w:r>
+              <w:t>Cla</w:t>
+            </w:r>
+            <w:proofErr w:type="spellEnd"/>
+            <w:proofErr w:type="gramStart"/>
+            <w:r>
+              <w:t> :A</w:t>
+            </w:r>
+            <w:proofErr w:type="gramEnd"/>
+            <w:r>
+              <w:t xml:space="preserve">     </w:t>
+            </w:r>
+          </w:p>
+        </w:tc>
+        <w:tc>
+          <w:tcPr>
+            <w:tcW w:w="2835" w:type="dxa"/>
+          </w:tcPr>
+          <w:p/>
+        </w:tc>
+      </w:tr>
+      <w:tr>
+        <w:tc>
+          <w:tcPr>
+            <w:tcW w:w="2547" w:type="dxa"/>
+          </w:tcPr>
+          <w:p>
+            <w:r>
+              <w:t>Pas en RX (débranché)</w:t>
+            </w:r>
+          </w:p>
+        </w:tc>
+        <w:tc>
+          <w:tcPr>
+            <w:tcW w:w="4394" w:type="dxa"/>
+          </w:tcPr>
+          <w:p>
+            <w:r>
+              <w:t>ABBB (0x</w:t>
+            </w:r>
+            <w:r>
+              <w:t>20</w:t>
+            </w:r>
+            <w:r>
+              <w:t xml:space="preserve"> : </w:t>
+            </w:r>
+            <w:proofErr w:type="spellStart"/>
+            <w:r>
+              <w:t>Ack</w:t>
+            </w:r>
+            <w:proofErr w:type="spellEnd"/>
+            <w:r>
+              <w:t xml:space="preserve">, </w:t>
+            </w:r>
+            <w:r>
+              <w:t>pas de</w:t>
+            </w:r>
+            <w:r>
+              <w:t xml:space="preserve"> ren</w:t>
+            </w:r>
+            <w:r>
+              <w:t xml:space="preserve">voi, RX </w:t>
+            </w:r>
+            <w:proofErr w:type="spellStart"/>
+            <w:r>
+              <w:t>apres</w:t>
+            </w:r>
+            <w:proofErr w:type="spellEnd"/>
+            <w:r>
+              <w:t xml:space="preserve">) </w:t>
+            </w:r>
+            <w:proofErr w:type="spellStart"/>
+            <w:r>
+              <w:t>Cla</w:t>
+            </w:r>
+            <w:proofErr w:type="spellEnd"/>
+            <w:proofErr w:type="gramStart"/>
+            <w:r>
+              <w:t> :A</w:t>
+            </w:r>
+            <w:proofErr w:type="gramEnd"/>
+            <w:r>
+              <w:t xml:space="preserve">     </w:t>
+            </w:r>
+          </w:p>
+        </w:tc>
+        <w:tc>
+          <w:tcPr>
+            <w:tcW w:w="2835" w:type="dxa"/>
+          </w:tcPr>
+          <w:p/>
+        </w:tc>
+      </w:tr>
+      <w:tr>
+        <w:tc>
+          <w:tcPr>
+            <w:tcW w:w="2547" w:type="dxa"/>
+          </w:tcPr>
+          <w:p>
+            <w:r>
+              <w:t>En RX</w:t>
+            </w:r>
+          </w:p>
+        </w:tc>
+        <w:tc>
+          <w:tcPr>
+            <w:tcW w:w="4394" w:type="dxa"/>
+          </w:tcPr>
+          <w:p>
+            <w:r>
+              <w:t>ABBB (0x</w:t>
+            </w:r>
+            <w:r>
+              <w:t>22</w:t>
+            </w:r>
+            <w:r>
+              <w:t xml:space="preserve"> : </w:t>
+            </w:r>
+            <w:proofErr w:type="spellStart"/>
+            <w:r>
+              <w:t>Ack</w:t>
+            </w:r>
+            <w:proofErr w:type="spellEnd"/>
+            <w:r>
+              <w:t xml:space="preserve">, </w:t>
+            </w:r>
+            <w:r>
               <w:t>1</w:t>
             </w:r>
             <w:r>
               <w:t xml:space="preserve"> ren</w:t>
             </w:r>
             <w:r>
-              <w:t xml:space="preserve">voi, pas de RX </w:t>
+              <w:t xml:space="preserve">voi, RX </w:t>
             </w:r>
             <w:proofErr w:type="spellStart"/>
             <w:r>
@@ -870,10 +1326,10 @@
           </w:tcPr>
           <w:p>
             <w:r>
-              <w:t>ABBB (0x0</w:t>
-            </w:r>
-            <w:r>
-              <w:t>2</w:t>
+              <w:t>ABBB (0x</w:t>
+            </w:r>
+            <w:r>
+              <w:t>22</w:t>
             </w:r>
             <w:r>
               <w:t xml:space="preserve"> : </w:t>
@@ -893,7 +1349,7 @@
               <w:t xml:space="preserve"> ren</w:t>
             </w:r>
             <w:r>
-              <w:t xml:space="preserve">voi, pas de RX </w:t>
+              <w:t xml:space="preserve">voi, RX </w:t>
             </w:r>
             <w:proofErr w:type="spellStart"/>
             <w:r>
@@ -942,10 +1398,10 @@
           </w:tcPr>
           <w:p>
             <w:r>
-              <w:t>ABBB (0x0</w:t>
-            </w:r>
-            <w:r>
-              <w:t>4</w:t>
+              <w:t>ABBB (0x</w:t>
+            </w:r>
+            <w:r>
+              <w:t>24</w:t>
             </w:r>
             <w:r>
               <w:t xml:space="preserve"> : </w:t>
@@ -965,7 +1421,7 @@
               <w:t xml:space="preserve"> ren</w:t>
             </w:r>
             <w:r>
-              <w:t xml:space="preserve">voi, pas de RX </w:t>
+              <w:t xml:space="preserve">voi, RX </w:t>
             </w:r>
             <w:proofErr w:type="spellStart"/>
             <w:r>
@@ -1014,10 +1470,10 @@
           </w:tcPr>
           <w:p>
             <w:r>
-              <w:t>ABBB (0x0</w:t>
-            </w:r>
-            <w:r>
-              <w:t>4</w:t>
+              <w:t>ABBB (0x</w:t>
+            </w:r>
+            <w:r>
+              <w:t>24</w:t>
             </w:r>
             <w:r>
               <w:t xml:space="preserve"> : </w:t>
@@ -1037,7 +1493,7 @@
               <w:t xml:space="preserve"> ren</w:t>
             </w:r>
             <w:r>
-              <w:t xml:space="preserve">voi, pas de RX </w:t>
+              <w:t xml:space="preserve">voi, RX </w:t>
             </w:r>
             <w:proofErr w:type="spellStart"/>
             <w:r>
@@ -1076,7 +1532,7 @@
           </w:tcPr>
           <w:p>
             <w:r>
-              <w:t>Pas en RX (débranché)</w:t>
+              <w:t>En RX</w:t>
             </w:r>
           </w:p>
         </w:tc>
@@ -1086,13 +1542,7 @@
           </w:tcPr>
           <w:p>
             <w:r>
-              <w:t>ABBB (0x</w:t>
-            </w:r>
-            <w:r>
-              <w:t>20</w:t>
-            </w:r>
-            <w:r>
-              <w:t xml:space="preserve"> : </w:t>
+              <w:t xml:space="preserve">HSLO (0x22, </w:t>
             </w:r>
             <w:proofErr w:type="spellStart"/>
             <w:r>
@@ -1100,16 +1550,7 @@
             </w:r>
             <w:proofErr w:type="spellEnd"/>
             <w:r>
-              <w:t xml:space="preserve">, </w:t>
-            </w:r>
-            <w:r>
-              <w:t>pas de</w:t>
-            </w:r>
-            <w:r>
-              <w:t xml:space="preserve"> ren</w:t>
-            </w:r>
-            <w:r>
-              <w:t xml:space="preserve">voi, RX </w:t>
+              <w:t xml:space="preserve">, 1 renvoi, RX </w:t>
             </w:r>
             <w:proofErr w:type="spellStart"/>
             <w:r>
@@ -1117,21 +1558,13 @@
             </w:r>
             <w:proofErr w:type="spellEnd"/>
             <w:r>
-              <w:t xml:space="preserve">) </w:t>
-            </w:r>
-            <w:proofErr w:type="spellStart"/>
-            <w:r>
-              <w:t>Cla</w:t>
-            </w:r>
-            <w:proofErr w:type="spellEnd"/>
+              <w:t>) Cl</w:t>
+            </w:r>
             <w:proofErr w:type="gramStart"/>
             <w:r>
               <w:t> :A</w:t>
             </w:r>
             <w:proofErr w:type="gramEnd"/>
-            <w:r>
-              <w:t xml:space="preserve">     </w:t>
-            </w:r>
           </w:p>
         </w:tc>
         <w:tc>
@@ -1158,13 +1591,7 @@
           </w:tcPr>
           <w:p>
             <w:r>
-              <w:t>ABBB (0x</w:t>
-            </w:r>
-            <w:r>
-              <w:t>22</w:t>
-            </w:r>
-            <w:r>
-              <w:t xml:space="preserve"> : </w:t>
+              <w:t xml:space="preserve">HSLO (0x22, </w:t>
             </w:r>
             <w:proofErr w:type="spellStart"/>
             <w:r>
@@ -1172,16 +1599,7 @@
             </w:r>
             <w:proofErr w:type="spellEnd"/>
             <w:r>
-              <w:t xml:space="preserve">, </w:t>
-            </w:r>
-            <w:r>
-              <w:t>1</w:t>
-            </w:r>
-            <w:r>
-              <w:t xml:space="preserve"> ren</w:t>
-            </w:r>
-            <w:r>
-              <w:t xml:space="preserve">voi, RX </w:t>
+              <w:t xml:space="preserve">, 1 renvoi, RX </w:t>
             </w:r>
             <w:proofErr w:type="spellStart"/>
             <w:r>
@@ -1189,20 +1607,7 @@
             </w:r>
             <w:proofErr w:type="spellEnd"/>
             <w:r>
-              <w:t xml:space="preserve">) </w:t>
-            </w:r>
-            <w:proofErr w:type="spellStart"/>
-            <w:r>
-              <w:t>Cla</w:t>
-            </w:r>
-            <w:proofErr w:type="spellEnd"/>
-            <w:proofErr w:type="gramStart"/>
-            <w:r>
-              <w:t> :A</w:t>
-            </w:r>
-            <w:proofErr w:type="gramEnd"/>
-            <w:r>
-              <w:t xml:space="preserve">     </w:t>
+              <w:t>) Cl :C</w:t>
             </w:r>
           </w:p>
         </w:tc>
@@ -1219,318 +1624,12 @@
             <w:tcW w:w="2547" w:type="dxa"/>
           </w:tcPr>
           <w:p>
-            <w:r>
-              <w:t>Pas en RX (débranché)</w:t>
-            </w:r>
-          </w:p>
-        </w:tc>
-        <w:tc>
-          <w:tcPr>
-            <w:tcW w:w="4394" w:type="dxa"/>
-          </w:tcPr>
-          <w:p>
-            <w:r>
-              <w:t>ABBB (0x</w:t>
-            </w:r>
-            <w:r>
-              <w:t>22</w:t>
-            </w:r>
-            <w:r>
-              <w:t xml:space="preserve"> : </w:t>
-            </w:r>
-            <w:proofErr w:type="spellStart"/>
-            <w:r>
-              <w:t>Ack</w:t>
-            </w:r>
-            <w:proofErr w:type="spellEnd"/>
-            <w:r>
-              <w:t xml:space="preserve">, </w:t>
-            </w:r>
-            <w:r>
-              <w:t>1</w:t>
-            </w:r>
-            <w:r>
-              <w:t xml:space="preserve"> ren</w:t>
-            </w:r>
-            <w:r>
-              <w:t xml:space="preserve">voi, RX </w:t>
-            </w:r>
-            <w:proofErr w:type="spellStart"/>
-            <w:r>
-              <w:t>apres</w:t>
-            </w:r>
-            <w:proofErr w:type="spellEnd"/>
-            <w:r>
-              <w:t xml:space="preserve">) </w:t>
-            </w:r>
-            <w:proofErr w:type="spellStart"/>
-            <w:r>
-              <w:t>Cla</w:t>
-            </w:r>
-            <w:proofErr w:type="spellEnd"/>
-            <w:proofErr w:type="gramStart"/>
-            <w:r>
-              <w:t> :A</w:t>
-            </w:r>
-            <w:proofErr w:type="gramEnd"/>
-            <w:r>
-              <w:t xml:space="preserve">     </w:t>
-            </w:r>
-          </w:p>
-        </w:tc>
-        <w:tc>
-          <w:tcPr>
-            <w:tcW w:w="2835" w:type="dxa"/>
-          </w:tcPr>
-          <w:p/>
-        </w:tc>
-      </w:tr>
-      <w:tr>
-        <w:tc>
-          <w:tcPr>
-            <w:tcW w:w="2547" w:type="dxa"/>
-          </w:tcPr>
-          <w:p>
-            <w:r>
-              <w:t>En RX</w:t>
-            </w:r>
-          </w:p>
-        </w:tc>
-        <w:tc>
-          <w:tcPr>
-            <w:tcW w:w="4394" w:type="dxa"/>
-          </w:tcPr>
-          <w:p>
-            <w:r>
-              <w:t>ABBB (0x</w:t>
-            </w:r>
-            <w:r>
-              <w:t>24</w:t>
-            </w:r>
-            <w:r>
-              <w:t xml:space="preserve"> : </w:t>
-            </w:r>
-            <w:proofErr w:type="spellStart"/>
-            <w:r>
-              <w:t>Ack</w:t>
-            </w:r>
-            <w:proofErr w:type="spellEnd"/>
-            <w:r>
-              <w:t xml:space="preserve">, </w:t>
-            </w:r>
-            <w:r>
-              <w:t>3</w:t>
-            </w:r>
-            <w:r>
-              <w:t xml:space="preserve"> ren</w:t>
-            </w:r>
-            <w:r>
-              <w:t xml:space="preserve">voi, RX </w:t>
-            </w:r>
-            <w:proofErr w:type="spellStart"/>
-            <w:r>
-              <w:t>apres</w:t>
-            </w:r>
-            <w:proofErr w:type="spellEnd"/>
-            <w:r>
-              <w:t xml:space="preserve">) </w:t>
-            </w:r>
-            <w:proofErr w:type="spellStart"/>
-            <w:r>
-              <w:t>Cla</w:t>
-            </w:r>
-            <w:proofErr w:type="spellEnd"/>
-            <w:proofErr w:type="gramStart"/>
-            <w:r>
-              <w:t> :A</w:t>
-            </w:r>
-            <w:proofErr w:type="gramEnd"/>
-            <w:r>
-              <w:t xml:space="preserve">     </w:t>
-            </w:r>
-          </w:p>
-        </w:tc>
-        <w:tc>
-          <w:tcPr>
-            <w:tcW w:w="2835" w:type="dxa"/>
-          </w:tcPr>
-          <w:p/>
-        </w:tc>
-      </w:tr>
-      <w:tr>
-        <w:tc>
-          <w:tcPr>
-            <w:tcW w:w="2547" w:type="dxa"/>
-          </w:tcPr>
-          <w:p>
-            <w:r>
-              <w:t>Pas en RX (débranché)</w:t>
-            </w:r>
-          </w:p>
-        </w:tc>
-        <w:tc>
-          <w:tcPr>
-            <w:tcW w:w="4394" w:type="dxa"/>
-          </w:tcPr>
-          <w:p>
-            <w:r>
-              <w:t>ABBB (0x</w:t>
-            </w:r>
-            <w:r>
-              <w:t>24</w:t>
-            </w:r>
-            <w:r>
-              <w:t xml:space="preserve"> : </w:t>
-            </w:r>
-            <w:proofErr w:type="spellStart"/>
-            <w:r>
-              <w:t>Ack</w:t>
-            </w:r>
-            <w:proofErr w:type="spellEnd"/>
-            <w:r>
-              <w:t xml:space="preserve">, </w:t>
-            </w:r>
-            <w:r>
-              <w:t>3</w:t>
-            </w:r>
-            <w:r>
-              <w:t xml:space="preserve"> ren</w:t>
-            </w:r>
-            <w:r>
-              <w:t xml:space="preserve">voi, RX </w:t>
-            </w:r>
-            <w:proofErr w:type="spellStart"/>
-            <w:r>
-              <w:t>apres</w:t>
-            </w:r>
-            <w:proofErr w:type="spellEnd"/>
-            <w:r>
-              <w:t xml:space="preserve">) </w:t>
-            </w:r>
-            <w:proofErr w:type="spellStart"/>
-            <w:r>
-              <w:t>Cla</w:t>
-            </w:r>
-            <w:proofErr w:type="spellEnd"/>
-            <w:proofErr w:type="gramStart"/>
-            <w:r>
-              <w:t> :A</w:t>
-            </w:r>
-            <w:proofErr w:type="gramEnd"/>
-            <w:r>
-              <w:t xml:space="preserve">     </w:t>
-            </w:r>
-          </w:p>
-        </w:tc>
-        <w:tc>
-          <w:tcPr>
-            <w:tcW w:w="2835" w:type="dxa"/>
-          </w:tcPr>
-          <w:p/>
-        </w:tc>
-      </w:tr>
-      <w:tr>
-        <w:tc>
-          <w:tcPr>
-            <w:tcW w:w="2547" w:type="dxa"/>
-          </w:tcPr>
-          <w:p>
-            <w:r>
-              <w:t>En RX</w:t>
-            </w:r>
-          </w:p>
-        </w:tc>
-        <w:tc>
-          <w:tcPr>
-            <w:tcW w:w="4394" w:type="dxa"/>
-          </w:tcPr>
-          <w:p>
-            <w:r>
-              <w:t xml:space="preserve">HSLO (0x22, </w:t>
-            </w:r>
-            <w:proofErr w:type="spellStart"/>
-            <w:r>
-              <w:t>Ack</w:t>
-            </w:r>
-            <w:proofErr w:type="spellEnd"/>
-            <w:r>
-              <w:t xml:space="preserve">, 1 renvoi, RX </w:t>
-            </w:r>
-            <w:proofErr w:type="spellStart"/>
-            <w:r>
-              <w:t>apres</w:t>
-            </w:r>
-            <w:proofErr w:type="spellEnd"/>
-            <w:r>
-              <w:t>) Cl</w:t>
-            </w:r>
-            <w:proofErr w:type="gramStart"/>
-            <w:r>
-              <w:t> :A</w:t>
-            </w:r>
-            <w:proofErr w:type="gramEnd"/>
-          </w:p>
-        </w:tc>
-        <w:tc>
-          <w:tcPr>
-            <w:tcW w:w="2835" w:type="dxa"/>
-          </w:tcPr>
-          <w:p/>
-        </w:tc>
-      </w:tr>
-      <w:tr>
-        <w:tc>
-          <w:tcPr>
-            <w:tcW w:w="2547" w:type="dxa"/>
-          </w:tcPr>
-          <w:p>
-            <w:r>
-              <w:t>En RX</w:t>
-            </w:r>
-          </w:p>
-        </w:tc>
-        <w:tc>
-          <w:tcPr>
-            <w:tcW w:w="4394" w:type="dxa"/>
-          </w:tcPr>
-          <w:p>
-            <w:r>
-              <w:t xml:space="preserve">HSLO (0x22, </w:t>
-            </w:r>
-            <w:proofErr w:type="spellStart"/>
-            <w:r>
-              <w:t>Ack</w:t>
-            </w:r>
-            <w:proofErr w:type="spellEnd"/>
-            <w:r>
-              <w:t xml:space="preserve">, 1 renvoi, RX </w:t>
-            </w:r>
-            <w:proofErr w:type="spellStart"/>
-            <w:r>
-              <w:t>apres</w:t>
-            </w:r>
-            <w:proofErr w:type="spellEnd"/>
-            <w:r>
-              <w:t>) Cl :C</w:t>
-            </w:r>
-          </w:p>
-        </w:tc>
-        <w:tc>
-          <w:tcPr>
-            <w:tcW w:w="2835" w:type="dxa"/>
-          </w:tcPr>
-          <w:p/>
-        </w:tc>
-      </w:tr>
-      <w:tr>
-        <w:tc>
-          <w:tcPr>
-            <w:tcW w:w="2547" w:type="dxa"/>
-          </w:tcPr>
-          <w:p>
-            <w:proofErr w:type="gramStart"/>
-            <w:r>
-              <w:t>1:I</w:t>
+            <w:proofErr w:type="gramStart"/>
+            <w:r>
+              <w:t>1:</w:t>
+            </w:r>
+            <w:r>
+              <w:t>U</w:t>
             </w:r>
             <w:proofErr w:type="gramEnd"/>
             <w:r>
@@ -1757,6 +1856,7 @@
         <w:spacing w:after="0" w:line="240" w:lineRule="auto"/>
       </w:pPr>
       <w:r>
+        <w:lastRenderedPageBreak/>
         <w:t>0x30 : Pas d’</w:t>
       </w:r>
       <w:proofErr w:type="spellStart"/>
@@ -1886,7 +1986,6 @@
         <w:spacing w:after="0" w:line="240" w:lineRule="auto"/>
       </w:pPr>
       <w:r>
-        <w:lastRenderedPageBreak/>
         <w:t xml:space="preserve">0x24 : </w:t>
       </w:r>
       <w:proofErr w:type="spellStart"/>

</xml_diff>